<commit_message>
auto: push changes 2026-09-14_18-30-43,25
</commit_message>
<xml_diff>
--- a/Generateur Des Factures/Factures/Facture numéro 18-2026.docx
+++ b/Generateur Des Factures/Factures/Facture numéro 18-2026.docx
@@ -62,10 +62,6 @@
               </w:rPr>
               <w:t>Facture numéro :  18/2026</w:t>
             </w:r>
-            <w:proofErr w:type="gramStart"/>
-            <w:proofErr w:type="gramEnd"/>
-            <w:proofErr w:type="spellStart"/>
-            <w:proofErr w:type="spellEnd"/>
           </w:p>
         </w:tc>
       </w:tr>
@@ -112,10 +108,34 @@
                 <w:szCs w:val="24"/>
                 <w:lang w:val="fr-FR" w:eastAsia="fr-MA"/>
               </w:rPr>
-              <w:t>Date : 14/09/2026</w:t>
+              <w:t>Date : 1</w:t>
             </w:r>
-            <w:proofErr w:type="spellStart"/>
-            <w:proofErr w:type="spellEnd"/>
+            <w:r>
+              <w:rPr>
+                <w:rFonts w:ascii="Aptos" w:eastAsia="Times New Roman" w:hAnsi="Aptos" w:cs="Arial"/>
+                <w:b/>
+                <w:bCs/>
+                <w:color w:val="000000"/>
+                <w:kern w:val="24"/>
+                <w:sz w:val="24"/>
+                <w:szCs w:val="24"/>
+                <w:lang w:val="fr-FR" w:eastAsia="fr-MA"/>
+              </w:rPr>
+              <w:t>7</w:t>
+            </w:r>
+            <w:r>
+              <w:rPr>
+                <w:rFonts w:ascii="Aptos" w:eastAsia="Times New Roman" w:hAnsi="Aptos" w:cs="Arial"/>
+                <w:b/>
+                <w:bCs/>
+                <w:color w:val="000000"/>
+                <w:kern w:val="24"/>
+                <w:sz w:val="24"/>
+                <w:szCs w:val="24"/>
+                <w:lang w:val="fr-FR" w:eastAsia="fr-MA"/>
+              </w:rPr>
+              <w:t>/09/2026</w:t>
+            </w:r>
           </w:p>
         </w:tc>
       </w:tr>
@@ -191,7 +211,6 @@
             </wp14:sizeRelV>
           </wp:anchor>
         </w:drawing>
-        <w:t/>
       </w:r>
     </w:p>
     <w:p>
@@ -232,7 +251,7 @@
     </w:p>
     <w:tbl>
       <w:tblPr>
-        <w:tblStyle w:val="TableGrid"/>
+        <w:tblStyle w:val="Grilledutableau"/>
         <w:tblpPr w:leftFromText="180" w:rightFromText="180" w:vertAnchor="text" w:horzAnchor="page" w:tblpX="661" w:tblpY="318"/>
         <w:tblW w:w="9180" w:type="dxa"/>
         <w:tblBorders>
@@ -267,6 +286,7 @@
                 <w:szCs w:val="28"/>
               </w:rPr>
             </w:pPr>
+            <w:proofErr w:type="spellStart"/>
             <w:r>
               <w:rPr>
                 <w:rFonts w:ascii="Aptos" w:eastAsia="+mn-ea" w:hAnsi="Aptos" w:cs="+mn-cs"/>
@@ -277,10 +297,21 @@
                 <w:sz w:val="28"/>
                 <w:szCs w:val="28"/>
               </w:rPr>
-              <w:t>Evix management</w:t>
+              <w:t>Evix</w:t>
             </w:r>
-            <w:proofErr w:type="spellStart"/>
             <w:proofErr w:type="spellEnd"/>
+            <w:r>
+              <w:rPr>
+                <w:rFonts w:ascii="Aptos" w:eastAsia="+mn-ea" w:hAnsi="Aptos" w:cs="+mn-cs"/>
+                <w:b/>
+                <w:bCs/>
+                <w:color w:val="000000"/>
+                <w:kern w:val="24"/>
+                <w:sz w:val="28"/>
+                <w:szCs w:val="28"/>
+              </w:rPr>
+              <w:t xml:space="preserve"> management</w:t>
+            </w:r>
           </w:p>
           <w:p>
             <w:pPr>
@@ -363,10 +394,32 @@
                 <w:szCs w:val="24"/>
                 <w:lang w:val="fr-FR"/>
               </w:rPr>
-              <w:t>Rue tafetacht spaces la rocade Rabat</w:t>
+              <w:t xml:space="preserve">Rue tafetacht </w:t>
             </w:r>
             <w:proofErr w:type="spellStart"/>
+            <w:r>
+              <w:rPr>
+                <w:rFonts w:ascii="Aptos" w:eastAsia="+mn-ea" w:hAnsi="Aptos" w:cs="+mn-cs"/>
+                <w:color w:val="000000"/>
+                <w:kern w:val="24"/>
+                <w:sz w:val="24"/>
+                <w:szCs w:val="24"/>
+                <w:lang w:val="fr-FR"/>
+              </w:rPr>
+              <w:t>spaces</w:t>
+            </w:r>
             <w:proofErr w:type="spellEnd"/>
+            <w:r>
+              <w:rPr>
+                <w:rFonts w:ascii="Aptos" w:eastAsia="+mn-ea" w:hAnsi="Aptos" w:cs="+mn-cs"/>
+                <w:color w:val="000000"/>
+                <w:kern w:val="24"/>
+                <w:sz w:val="24"/>
+                <w:szCs w:val="24"/>
+                <w:lang w:val="fr-FR"/>
+              </w:rPr>
+              <w:t xml:space="preserve"> la rocade Rabat</w:t>
+            </w:r>
           </w:p>
         </w:tc>
       </w:tr>
@@ -398,8 +451,6 @@
               </w:rPr>
               <w:t>ICE : 001559299000031</w:t>
             </w:r>
-            <w:proofErr w:type="spellStart"/>
-            <w:proofErr w:type="spellEnd"/>
           </w:p>
         </w:tc>
       </w:tr>
@@ -796,17 +847,6 @@
               </w:rPr>
               <w:t xml:space="preserve">• Habilitation électrique </w:t>
             </w:r>
-            <w:r>
-              <w:rPr>
-                <w:rFonts w:ascii="Arial" w:eastAsia="Times New Roman" w:hAnsi="Arial" w:cs="Arial"/>
-                <w:b/>
-                <w:bCs/>
-                <w:sz w:val="20"/>
-                <w:szCs w:val="20"/>
-                <w:lang w:eastAsia="fr-MA"/>
-              </w:rPr>
-              <w:t/>
-            </w:r>
           </w:p>
           <w:p>
             <w:pPr>
@@ -860,16 +900,26 @@
               </w:rPr>
               <w:t xml:space="preserve"> </w:t>
             </w:r>
+          </w:p>
+          <w:p>
+            <w:pPr>
+              <w:spacing w:after="0" w:line="240" w:lineRule="auto"/>
+              <w:ind w:left="120"/>
+              <w:rPr>
+                <w:rFonts w:ascii="Arial" w:eastAsia="Times New Roman" w:hAnsi="Arial" w:cs="Arial"/>
+                <w:sz w:val="24"/>
+                <w:szCs w:val="24"/>
+                <w:lang w:val="fr-FR" w:eastAsia="fr-MA"/>
+              </w:rPr>
+            </w:pPr>
             <w:r>
               <w:rPr>
                 <w:rFonts w:ascii="Arial" w:eastAsia="Times New Roman" w:hAnsi="Arial" w:cs="Arial"/>
-                <w:b/>
-                <w:bCs/>
-                <w:sz w:val="20"/>
-                <w:szCs w:val="20"/>
-                <w:lang w:eastAsia="fr-MA"/>
-              </w:rPr>
-              <w:t/>
+                <w:sz w:val="24"/>
+                <w:szCs w:val="24"/>
+                <w:lang w:val="fr-FR" w:eastAsia="fr-MA"/>
+              </w:rPr>
+              <w:t xml:space="preserve"> </w:t>
             </w:r>
           </w:p>
           <w:p>
@@ -891,49 +941,6 @@
                 <w:lang w:val="fr-FR" w:eastAsia="fr-MA"/>
               </w:rPr>
               <w:t xml:space="preserve"> </w:t>
-            </w:r>
-            <w:r>
-              <w:rPr>
-                <w:rFonts w:ascii="Arial" w:eastAsia="Times New Roman" w:hAnsi="Arial" w:cs="Arial"/>
-                <w:b/>
-                <w:bCs/>
-                <w:sz w:val="20"/>
-                <w:szCs w:val="20"/>
-                <w:lang w:eastAsia="fr-MA"/>
-              </w:rPr>
-              <w:t/>
-            </w:r>
-          </w:p>
-          <w:p>
-            <w:pPr>
-              <w:spacing w:after="0" w:line="240" w:lineRule="auto"/>
-              <w:ind w:left="120"/>
-              <w:rPr>
-                <w:rFonts w:ascii="Arial" w:eastAsia="Times New Roman" w:hAnsi="Arial" w:cs="Arial"/>
-                <w:sz w:val="24"/>
-                <w:szCs w:val="24"/>
-                <w:lang w:val="fr-FR" w:eastAsia="fr-MA"/>
-              </w:rPr>
-            </w:pPr>
-            <w:r>
-              <w:rPr>
-                <w:rFonts w:ascii="Arial" w:eastAsia="Times New Roman" w:hAnsi="Arial" w:cs="Arial"/>
-                <w:sz w:val="24"/>
-                <w:szCs w:val="24"/>
-                <w:lang w:val="fr-FR" w:eastAsia="fr-MA"/>
-              </w:rPr>
-              <w:t xml:space="preserve"> </w:t>
-            </w:r>
-            <w:r>
-              <w:rPr>
-                <w:rFonts w:ascii="Arial" w:eastAsia="Times New Roman" w:hAnsi="Arial" w:cs="Arial"/>
-                <w:b/>
-                <w:bCs/>
-                <w:sz w:val="20"/>
-                <w:szCs w:val="20"/>
-                <w:lang w:eastAsia="fr-MA"/>
-              </w:rPr>
-              <w:t/>
             </w:r>
           </w:p>
           <w:p>
@@ -1012,17 +1019,6 @@
                 <w:lang w:val="en-US" w:eastAsia="fr-MA"/>
               </w:rPr>
             </w:pPr>
-            <w:r>
-              <w:rPr>
-                <w:rFonts w:ascii="Aptos" w:eastAsia="Times New Roman" w:hAnsi="Aptos" w:cs="Arial"/>
-                <w:color w:val="000000"/>
-                <w:kern w:val="24"/>
-                <w:sz w:val="24"/>
-                <w:szCs w:val="24"/>
-                <w:lang w:val="en-US" w:eastAsia="fr-MA"/>
-              </w:rPr>
-              <w:t/>
-            </w:r>
           </w:p>
           <w:p>
             <w:pPr>
@@ -1036,17 +1032,6 @@
                 <w:lang w:val="en-US" w:eastAsia="fr-MA"/>
               </w:rPr>
             </w:pPr>
-            <w:r>
-              <w:rPr>
-                <w:rFonts w:ascii="Aptos" w:eastAsia="Times New Roman" w:hAnsi="Aptos" w:cs="Arial"/>
-                <w:color w:val="000000"/>
-                <w:kern w:val="24"/>
-                <w:sz w:val="24"/>
-                <w:szCs w:val="24"/>
-                <w:lang w:val="en-US" w:eastAsia="fr-MA"/>
-              </w:rPr>
-              <w:t/>
-            </w:r>
           </w:p>
           <w:p>
             <w:pPr>
@@ -1060,17 +1045,6 @@
                 <w:lang w:val="en-US" w:eastAsia="fr-MA"/>
               </w:rPr>
             </w:pPr>
-            <w:r>
-              <w:rPr>
-                <w:rFonts w:ascii="Aptos" w:eastAsia="Times New Roman" w:hAnsi="Aptos" w:cs="Arial"/>
-                <w:color w:val="000000"/>
-                <w:kern w:val="24"/>
-                <w:sz w:val="24"/>
-                <w:szCs w:val="24"/>
-                <w:lang w:val="en-US" w:eastAsia="fr-MA"/>
-              </w:rPr>
-              <w:t/>
-            </w:r>
           </w:p>
           <w:p>
             <w:pPr>
@@ -1084,17 +1058,6 @@
                 <w:lang w:val="en-US" w:eastAsia="fr-MA"/>
               </w:rPr>
             </w:pPr>
-            <w:r>
-              <w:rPr>
-                <w:rFonts w:ascii="Aptos" w:eastAsia="Times New Roman" w:hAnsi="Aptos" w:cs="Arial"/>
-                <w:color w:val="000000"/>
-                <w:kern w:val="24"/>
-                <w:sz w:val="24"/>
-                <w:szCs w:val="24"/>
-                <w:lang w:val="en-US" w:eastAsia="fr-MA"/>
-              </w:rPr>
-              <w:t/>
-            </w:r>
           </w:p>
         </w:tc>
         <w:tc>
@@ -1150,17 +1113,6 @@
                 <w:lang w:val="en-US" w:eastAsia="fr-MA"/>
               </w:rPr>
             </w:pPr>
-            <w:r>
-              <w:rPr>
-                <w:rFonts w:ascii="Aptos" w:eastAsia="Times New Roman" w:hAnsi="Aptos" w:cs="Arial"/>
-                <w:color w:val="000000"/>
-                <w:kern w:val="24"/>
-                <w:sz w:val="24"/>
-                <w:szCs w:val="24"/>
-                <w:lang w:val="en-US" w:eastAsia="fr-MA"/>
-              </w:rPr>
-              <w:t/>
-            </w:r>
           </w:p>
           <w:p>
             <w:pPr>
@@ -1174,17 +1126,6 @@
                 <w:lang w:val="en-US" w:eastAsia="fr-MA"/>
               </w:rPr>
             </w:pPr>
-            <w:r>
-              <w:rPr>
-                <w:rFonts w:ascii="Aptos" w:eastAsia="Times New Roman" w:hAnsi="Aptos" w:cs="Arial"/>
-                <w:color w:val="000000"/>
-                <w:kern w:val="24"/>
-                <w:sz w:val="24"/>
-                <w:szCs w:val="24"/>
-                <w:lang w:val="en-US" w:eastAsia="fr-MA"/>
-              </w:rPr>
-              <w:t/>
-            </w:r>
           </w:p>
           <w:p>
             <w:pPr>
@@ -1198,17 +1139,6 @@
                 <w:lang w:val="en-US" w:eastAsia="fr-MA"/>
               </w:rPr>
             </w:pPr>
-            <w:r>
-              <w:rPr>
-                <w:rFonts w:ascii="Aptos" w:eastAsia="Times New Roman" w:hAnsi="Aptos" w:cs="Arial"/>
-                <w:color w:val="000000"/>
-                <w:kern w:val="24"/>
-                <w:sz w:val="24"/>
-                <w:szCs w:val="24"/>
-                <w:lang w:val="en-US" w:eastAsia="fr-MA"/>
-              </w:rPr>
-              <w:t/>
-            </w:r>
           </w:p>
           <w:p>
             <w:pPr>
@@ -1222,17 +1152,6 @@
                 <w:lang w:val="en-US" w:eastAsia="fr-MA"/>
               </w:rPr>
             </w:pPr>
-            <w:r>
-              <w:rPr>
-                <w:rFonts w:ascii="Aptos" w:eastAsia="Times New Roman" w:hAnsi="Aptos" w:cs="Arial"/>
-                <w:color w:val="000000"/>
-                <w:kern w:val="24"/>
-                <w:sz w:val="24"/>
-                <w:szCs w:val="24"/>
-                <w:lang w:val="en-US" w:eastAsia="fr-MA"/>
-              </w:rPr>
-              <w:t/>
-            </w:r>
           </w:p>
         </w:tc>
         <w:tc>
@@ -1288,17 +1207,6 @@
                 <w:lang w:val="en-US" w:eastAsia="fr-MA"/>
               </w:rPr>
             </w:pPr>
-            <w:r>
-              <w:rPr>
-                <w:rFonts w:ascii="Aptos" w:eastAsia="Times New Roman" w:hAnsi="Aptos" w:cs="Arial"/>
-                <w:color w:val="000000"/>
-                <w:kern w:val="24"/>
-                <w:sz w:val="24"/>
-                <w:szCs w:val="24"/>
-                <w:lang w:val="en-US" w:eastAsia="fr-MA"/>
-              </w:rPr>
-              <w:t/>
-            </w:r>
           </w:p>
           <w:p>
             <w:pPr>
@@ -1312,17 +1220,6 @@
                 <w:lang w:val="en-US" w:eastAsia="fr-MA"/>
               </w:rPr>
             </w:pPr>
-            <w:r>
-              <w:rPr>
-                <w:rFonts w:ascii="Aptos" w:eastAsia="Times New Roman" w:hAnsi="Aptos" w:cs="Arial"/>
-                <w:color w:val="000000"/>
-                <w:kern w:val="24"/>
-                <w:sz w:val="24"/>
-                <w:szCs w:val="24"/>
-                <w:lang w:val="en-US" w:eastAsia="fr-MA"/>
-              </w:rPr>
-              <w:t/>
-            </w:r>
           </w:p>
           <w:p>
             <w:pPr>
@@ -1336,17 +1233,6 @@
                 <w:lang w:val="en-US" w:eastAsia="fr-MA"/>
               </w:rPr>
             </w:pPr>
-            <w:r>
-              <w:rPr>
-                <w:rFonts w:ascii="Aptos" w:eastAsia="Times New Roman" w:hAnsi="Aptos" w:cs="Arial"/>
-                <w:color w:val="000000"/>
-                <w:kern w:val="24"/>
-                <w:sz w:val="24"/>
-                <w:szCs w:val="24"/>
-                <w:lang w:val="en-US" w:eastAsia="fr-MA"/>
-              </w:rPr>
-              <w:t/>
-            </w:r>
           </w:p>
           <w:p>
             <w:pPr>
@@ -1360,17 +1246,6 @@
                 <w:lang w:val="en-US" w:eastAsia="fr-MA"/>
               </w:rPr>
             </w:pPr>
-            <w:r>
-              <w:rPr>
-                <w:rFonts w:ascii="Aptos" w:eastAsia="Times New Roman" w:hAnsi="Aptos" w:cs="Arial"/>
-                <w:color w:val="000000"/>
-                <w:kern w:val="24"/>
-                <w:sz w:val="24"/>
-                <w:szCs w:val="24"/>
-                <w:lang w:val="en-US" w:eastAsia="fr-MA"/>
-              </w:rPr>
-              <w:t/>
-            </w:r>
           </w:p>
         </w:tc>
       </w:tr>
@@ -1385,16 +1260,16 @@
     </w:p>
     <w:tbl>
       <w:tblPr>
-        <w:tblStyle w:val="TableGrid"/>
+        <w:tblStyle w:val="Grilledutableau"/>
         <w:tblpPr w:leftFromText="141" w:rightFromText="141" w:vertAnchor="text" w:horzAnchor="page" w:tblpX="685" w:tblpY="-17"/>
         <w:tblOverlap w:val="never"/>
         <w:tblW w:w="9776" w:type="dxa"/>
         <w:tblLook w:val="04A0" w:firstRow="1" w:lastRow="0" w:firstColumn="1" w:lastColumn="0" w:noHBand="0" w:noVBand="1"/>
       </w:tblPr>
       <w:tblGrid>
-        <w:gridCol w:w="5027"/>
-        <w:gridCol w:w="2924"/>
-        <w:gridCol w:w="1825"/>
+        <w:gridCol w:w="5382"/>
+        <w:gridCol w:w="3118"/>
+        <w:gridCol w:w="1276"/>
       </w:tblGrid>
       <w:tr>
         <w:tc>
@@ -1441,8 +1316,6 @@
               </w:rPr>
               <w:t>10000</w:t>
             </w:r>
-            <w:proofErr w:type="spellStart"/>
-            <w:proofErr w:type="spellEnd"/>
           </w:p>
         </w:tc>
       </w:tr>
@@ -1482,8 +1355,6 @@
             <w:r>
               <w:t>ARRETE LA PRESENTE FACTURE A LA SOMME DE : #Dix mille dirhams#</w:t>
             </w:r>
-            <w:proofErr w:type="gramStart"/>
-            <w:proofErr w:type="gramEnd"/>
           </w:p>
           <w:p>
             <w:pPr>
@@ -1511,10 +1382,6 @@
               </w:rPr>
               <w:t>Attijariwafa Bank RIB :  007780000401230040249794</w:t>
             </w:r>
-            <w:proofErr w:type="gramStart"/>
-            <w:proofErr w:type="gramEnd"/>
-            <w:proofErr w:type="spellStart"/>
-            <w:proofErr w:type="spellEnd"/>
           </w:p>
         </w:tc>
       </w:tr>
@@ -1612,7 +1479,6 @@
             </wp14:sizeRelV>
           </wp:anchor>
         </w:drawing>
-        <w:t/>
       </w:r>
       <w:r>
         <w:rPr>
@@ -1670,7 +1536,7 @@
 <w:ftr xmlns:wpc="http://schemas.microsoft.com/office/word/2010/wordprocessingCanvas" xmlns:cx="http://schemas.microsoft.com/office/drawing/2014/chartex" xmlns:cx1="http://schemas.microsoft.com/office/drawing/2015/9/8/chartex" xmlns:cx2="http://schemas.microsoft.com/office/drawing/2015/10/21/chartex" xmlns:cx3="http://schemas.microsoft.com/office/drawing/2016/5/9/chartex" xmlns:cx4="http://schemas.microsoft.com/office/drawing/2016/5/10/chartex" xmlns:cx5="http://schemas.microsoft.com/office/drawing/2016/5/11/chartex" xmlns:cx6="http://schemas.microsoft.com/office/drawing/2016/5/12/chartex" xmlns:cx7="http://schemas.microsoft.com/office/drawing/2016/5/13/chartex" xmlns:cx8="http://schemas.microsoft.com/office/drawing/2016/5/14/chartex" xmlns:mc="http://schemas.openxmlformats.org/markup-compatibility/2006" xmlns:aink="http://schemas.microsoft.com/office/drawing/2016/ink" xmlns:am3d="http://schemas.microsoft.com/office/drawing/2017/model3d" xmlns:o="urn:schemas-microsoft-com:office:office" xmlns:oel="http://schemas.microsoft.com/office/2019/extlst" xmlns:r="http://schemas.openxmlformats.org/officeDocument/2006/relationships" xmlns:m="http://schemas.openxmlformats.org/officeDocument/2006/math" xmlns:v="urn:schemas-microsoft-com:vml" xmlns:wp14="http://schemas.microsoft.com/office/word/2010/wordprocessingDrawing" xmlns:wp="http://schemas.openxmlformats.org/drawingml/2006/wordprocessingDrawing" xmlns:w10="urn:schemas-microsoft-com:office:word" xmlns:w="http://schemas.openxmlformats.org/wordprocessingml/2006/main" xmlns:w14="http://schemas.microsoft.com/office/word/2010/wordml" xmlns:w15="http://schemas.microsoft.com/office/word/2012/wordml" xmlns:w16cex="http://schemas.microsoft.com/office/word/2018/wordml/cex" xmlns:w16cid="http://schemas.microsoft.com/office/word/2016/wordml/cid" xmlns:w16="http://schemas.microsoft.com/office/word/2018/wordml" xmlns:w16du="http://schemas.microsoft.com/office/word/2023/wordml/word16du" xmlns:w16sdtdh="http://schemas.microsoft.com/office/word/2020/wordml/sdtdatahash" xmlns:w16sdtfl="http://schemas.microsoft.com/office/word/2024/wordml/sdtformatlock" xmlns:w16se="http://schemas.microsoft.com/office/word/2015/wordml/symex" xmlns:wpg="http://schemas.microsoft.com/office/word/2010/wordprocessingGroup" xmlns:wpi="http://schemas.microsoft.com/office/word/2010/wordprocessingInk" xmlns:wne="http://schemas.microsoft.com/office/word/2006/wordml" xmlns:wps="http://schemas.microsoft.com/office/word/2010/wordprocessingShape" mc:Ignorable="w14 w15 w16se w16cid w16 w16cex w16sdtdh w16sdtfl w16du wp14">
   <w:p>
     <w:pPr>
-      <w:pStyle w:val="Footer"/>
+      <w:pStyle w:val="Pieddepage"/>
     </w:pPr>
   </w:p>
 </w:ftr>
@@ -1680,7 +1546,7 @@
 <w:ftr xmlns:wpc="http://schemas.microsoft.com/office/word/2010/wordprocessingCanvas" xmlns:cx="http://schemas.microsoft.com/office/drawing/2014/chartex" xmlns:cx1="http://schemas.microsoft.com/office/drawing/2015/9/8/chartex" xmlns:cx2="http://schemas.microsoft.com/office/drawing/2015/10/21/chartex" xmlns:cx3="http://schemas.microsoft.com/office/drawing/2016/5/9/chartex" xmlns:cx4="http://schemas.microsoft.com/office/drawing/2016/5/10/chartex" xmlns:cx5="http://schemas.microsoft.com/office/drawing/2016/5/11/chartex" xmlns:cx6="http://schemas.microsoft.com/office/drawing/2016/5/12/chartex" xmlns:cx7="http://schemas.microsoft.com/office/drawing/2016/5/13/chartex" xmlns:cx8="http://schemas.microsoft.com/office/drawing/2016/5/14/chartex" xmlns:mc="http://schemas.openxmlformats.org/markup-compatibility/2006" xmlns:aink="http://schemas.microsoft.com/office/drawing/2016/ink" xmlns:am3d="http://schemas.microsoft.com/office/drawing/2017/model3d" xmlns:o="urn:schemas-microsoft-com:office:office" xmlns:oel="http://schemas.microsoft.com/office/2019/extlst" xmlns:r="http://schemas.openxmlformats.org/officeDocument/2006/relationships" xmlns:m="http://schemas.openxmlformats.org/officeDocument/2006/math" xmlns:v="urn:schemas-microsoft-com:vml" xmlns:wp14="http://schemas.microsoft.com/office/word/2010/wordprocessingDrawing" xmlns:wp="http://schemas.openxmlformats.org/drawingml/2006/wordprocessingDrawing" xmlns:w10="urn:schemas-microsoft-com:office:word" xmlns:w="http://schemas.openxmlformats.org/wordprocessingml/2006/main" xmlns:w14="http://schemas.microsoft.com/office/word/2010/wordml" xmlns:w15="http://schemas.microsoft.com/office/word/2012/wordml" xmlns:w16cex="http://schemas.microsoft.com/office/word/2018/wordml/cex" xmlns:w16cid="http://schemas.microsoft.com/office/word/2016/wordml/cid" xmlns:w16="http://schemas.microsoft.com/office/word/2018/wordml" xmlns:w16du="http://schemas.microsoft.com/office/word/2023/wordml/word16du" xmlns:w16sdtdh="http://schemas.microsoft.com/office/word/2020/wordml/sdtdatahash" xmlns:w16sdtfl="http://schemas.microsoft.com/office/word/2024/wordml/sdtformatlock" xmlns:w16se="http://schemas.microsoft.com/office/word/2015/wordml/symex" xmlns:wpg="http://schemas.microsoft.com/office/word/2010/wordprocessingGroup" xmlns:wpi="http://schemas.microsoft.com/office/word/2010/wordprocessingInk" xmlns:wne="http://schemas.microsoft.com/office/word/2006/wordml" xmlns:wps="http://schemas.microsoft.com/office/word/2010/wordprocessingShape" mc:Ignorable="w14 w15 w16se w16cid w16 w16cex w16sdtdh w16sdtfl w16du wp14">
   <w:p>
     <w:pPr>
-      <w:pStyle w:val="Footer"/>
+      <w:pStyle w:val="Pieddepage"/>
       <w:rPr>
         <w:rFonts w:ascii="Calibri" w:eastAsia="Calibri" w:hAnsi="Calibri" w:cs="Times New Roman"/>
         <w:sz w:val="26"/>
@@ -1707,9 +1573,8 @@
         <w:vertAlign w:val="superscript"/>
         <w:lang w:val="x-none" w:eastAsia="x-none"/>
       </w:rPr>
-      <w:t xml:space="preserve">Art 91 – II – 1° du Code </w:t>
+      <w:t>Art 91 – II – 1° du Code Général des Impôts.</w:t>
     </w:r>
-    <w:proofErr w:type="spellStart"/>
     <w:r>
       <w:rPr>
         <w:rFonts w:ascii="Calibri" w:eastAsia="Calibri" w:hAnsi="Calibri" w:cs="Times New Roman"/>
@@ -1718,49 +1583,6 @@
         <w:vertAlign w:val="superscript"/>
         <w:lang w:val="x-none" w:eastAsia="x-none"/>
       </w:rPr>
-      <w:t>Général</w:t>
-    </w:r>
-    <w:proofErr w:type="spellEnd"/>
-    <w:r>
-      <w:rPr>
-        <w:rFonts w:ascii="Calibri" w:eastAsia="Calibri" w:hAnsi="Calibri" w:cs="Times New Roman"/>
-        <w:sz w:val="26"/>
-        <w:szCs w:val="26"/>
-        <w:vertAlign w:val="superscript"/>
-        <w:lang w:val="x-none" w:eastAsia="x-none"/>
-      </w:rPr>
-      <w:t xml:space="preserve"> des </w:t>
-    </w:r>
-    <w:proofErr w:type="spellStart"/>
-    <w:r>
-      <w:rPr>
-        <w:rFonts w:ascii="Calibri" w:eastAsia="Calibri" w:hAnsi="Calibri" w:cs="Times New Roman"/>
-        <w:sz w:val="26"/>
-        <w:szCs w:val="26"/>
-        <w:vertAlign w:val="superscript"/>
-        <w:lang w:val="x-none" w:eastAsia="x-none"/>
-      </w:rPr>
-      <w:t>Impôts</w:t>
-    </w:r>
-    <w:proofErr w:type="spellEnd"/>
-    <w:r>
-      <w:rPr>
-        <w:rFonts w:ascii="Calibri" w:eastAsia="Calibri" w:hAnsi="Calibri" w:cs="Times New Roman"/>
-        <w:sz w:val="26"/>
-        <w:szCs w:val="26"/>
-        <w:vertAlign w:val="superscript"/>
-        <w:lang w:val="x-none" w:eastAsia="x-none"/>
-      </w:rPr>
-      <w:t>.</w:t>
-    </w:r>
-    <w:r>
-      <w:rPr>
-        <w:rFonts w:ascii="Calibri" w:eastAsia="Calibri" w:hAnsi="Calibri" w:cs="Times New Roman"/>
-        <w:sz w:val="26"/>
-        <w:szCs w:val="26"/>
-        <w:vertAlign w:val="superscript"/>
-        <w:lang w:val="x-none" w:eastAsia="x-none"/>
-      </w:rPr>
       <w:t xml:space="preserve">                                          </w:t>
     </w:r>
   </w:p>
@@ -1780,7 +1602,7 @@
   </w:p>
   <w:tbl>
     <w:tblPr>
-      <w:tblStyle w:val="TableGrid"/>
+      <w:tblStyle w:val="Grilledutableau"/>
       <w:tblW w:w="0" w:type="auto"/>
       <w:tblInd w:w="-5" w:type="dxa"/>
       <w:tblBorders>
@@ -1805,7 +1627,7 @@
         </w:tcPr>
         <w:p>
           <w:pPr>
-            <w:pStyle w:val="Footer"/>
+            <w:pStyle w:val="Pieddepage"/>
             <w:jc w:val="both"/>
             <w:rPr>
               <w:rFonts w:ascii="Calibri" w:eastAsia="Calibri" w:hAnsi="Calibri" w:cs="Times New Roman"/>
@@ -1870,7 +1692,7 @@
         </w:tcPr>
         <w:p>
           <w:pPr>
-            <w:pStyle w:val="Footer"/>
+            <w:pStyle w:val="Pieddepage"/>
             <w:jc w:val="both"/>
             <w:rPr>
               <w:rFonts w:ascii="Calibri" w:eastAsia="Calibri" w:hAnsi="Calibri" w:cs="Times New Roman"/>
@@ -1913,7 +1735,7 @@
         </w:tcPr>
         <w:p>
           <w:pPr>
-            <w:pStyle w:val="Footer"/>
+            <w:pStyle w:val="Pieddepage"/>
             <w:jc w:val="both"/>
             <w:rPr>
               <w:rFonts w:ascii="Calibri" w:eastAsia="Calibri" w:hAnsi="Calibri" w:cs="Times New Roman"/>
@@ -1954,7 +1776,7 @@
         </w:tcPr>
         <w:p>
           <w:pPr>
-            <w:pStyle w:val="Footer"/>
+            <w:pStyle w:val="Pieddepage"/>
             <w:jc w:val="both"/>
             <w:rPr>
               <w:rFonts w:ascii="Calibri" w:eastAsia="Calibri" w:hAnsi="Calibri" w:cs="Times New Roman"/>
@@ -1999,7 +1821,7 @@
         </w:tcPr>
         <w:p>
           <w:pPr>
-            <w:pStyle w:val="Footer"/>
+            <w:pStyle w:val="Pieddepage"/>
             <w:jc w:val="both"/>
             <w:rPr>
               <w:rFonts w:ascii="Calibri" w:eastAsia="Calibri" w:hAnsi="Calibri" w:cs="Times New Roman"/>
@@ -2068,7 +1890,7 @@
         </w:tcPr>
         <w:p>
           <w:pPr>
-            <w:pStyle w:val="Footer"/>
+            <w:pStyle w:val="Pieddepage"/>
             <w:jc w:val="both"/>
             <w:rPr>
               <w:rFonts w:ascii="Calibri" w:eastAsia="Calibri" w:hAnsi="Calibri" w:cs="Times New Roman"/>
@@ -2121,7 +1943,7 @@
         </w:tcPr>
         <w:p>
           <w:pPr>
-            <w:pStyle w:val="Footer"/>
+            <w:pStyle w:val="Pieddepage"/>
             <w:jc w:val="both"/>
             <w:rPr>
               <w:rFonts w:ascii="Calibri" w:eastAsia="Calibri" w:hAnsi="Calibri" w:cs="Times New Roman"/>
@@ -2190,7 +2012,7 @@
         </w:tcPr>
         <w:p>
           <w:pPr>
-            <w:pStyle w:val="Footer"/>
+            <w:pStyle w:val="Pieddepage"/>
             <w:jc w:val="both"/>
             <w:rPr>
               <w:rFonts w:ascii="Calibri" w:eastAsia="Calibri" w:hAnsi="Calibri" w:cs="Times New Roman"/>
@@ -2254,7 +2076,7 @@
   </w:tbl>
   <w:p>
     <w:pPr>
-      <w:pStyle w:val="Footer"/>
+      <w:pStyle w:val="Pieddepage"/>
       <w:jc w:val="both"/>
       <w:rPr>
         <w:sz w:val="26"/>
@@ -2269,7 +2091,7 @@
 <w:ftr xmlns:wpc="http://schemas.microsoft.com/office/word/2010/wordprocessingCanvas" xmlns:cx="http://schemas.microsoft.com/office/drawing/2014/chartex" xmlns:cx1="http://schemas.microsoft.com/office/drawing/2015/9/8/chartex" xmlns:cx2="http://schemas.microsoft.com/office/drawing/2015/10/21/chartex" xmlns:cx3="http://schemas.microsoft.com/office/drawing/2016/5/9/chartex" xmlns:cx4="http://schemas.microsoft.com/office/drawing/2016/5/10/chartex" xmlns:cx5="http://schemas.microsoft.com/office/drawing/2016/5/11/chartex" xmlns:cx6="http://schemas.microsoft.com/office/drawing/2016/5/12/chartex" xmlns:cx7="http://schemas.microsoft.com/office/drawing/2016/5/13/chartex" xmlns:cx8="http://schemas.microsoft.com/office/drawing/2016/5/14/chartex" xmlns:mc="http://schemas.openxmlformats.org/markup-compatibility/2006" xmlns:aink="http://schemas.microsoft.com/office/drawing/2016/ink" xmlns:am3d="http://schemas.microsoft.com/office/drawing/2017/model3d" xmlns:o="urn:schemas-microsoft-com:office:office" xmlns:oel="http://schemas.microsoft.com/office/2019/extlst" xmlns:r="http://schemas.openxmlformats.org/officeDocument/2006/relationships" xmlns:m="http://schemas.openxmlformats.org/officeDocument/2006/math" xmlns:v="urn:schemas-microsoft-com:vml" xmlns:wp14="http://schemas.microsoft.com/office/word/2010/wordprocessingDrawing" xmlns:wp="http://schemas.openxmlformats.org/drawingml/2006/wordprocessingDrawing" xmlns:w10="urn:schemas-microsoft-com:office:word" xmlns:w="http://schemas.openxmlformats.org/wordprocessingml/2006/main" xmlns:w14="http://schemas.microsoft.com/office/word/2010/wordml" xmlns:w15="http://schemas.microsoft.com/office/word/2012/wordml" xmlns:w16cex="http://schemas.microsoft.com/office/word/2018/wordml/cex" xmlns:w16cid="http://schemas.microsoft.com/office/word/2016/wordml/cid" xmlns:w16="http://schemas.microsoft.com/office/word/2018/wordml" xmlns:w16du="http://schemas.microsoft.com/office/word/2023/wordml/word16du" xmlns:w16sdtdh="http://schemas.microsoft.com/office/word/2020/wordml/sdtdatahash" xmlns:w16sdtfl="http://schemas.microsoft.com/office/word/2024/wordml/sdtformatlock" xmlns:w16se="http://schemas.microsoft.com/office/word/2015/wordml/symex" xmlns:wpg="http://schemas.microsoft.com/office/word/2010/wordprocessingGroup" xmlns:wpi="http://schemas.microsoft.com/office/word/2010/wordprocessingInk" xmlns:wne="http://schemas.microsoft.com/office/word/2006/wordml" xmlns:wps="http://schemas.microsoft.com/office/word/2010/wordprocessingShape" mc:Ignorable="w14 w15 w16se w16cid w16 w16cex w16sdtdh w16sdtfl w16du wp14">
   <w:p>
     <w:pPr>
-      <w:pStyle w:val="Footer"/>
+      <w:pStyle w:val="Pieddepage"/>
     </w:pPr>
   </w:p>
 </w:ftr>
@@ -2304,7 +2126,7 @@
 <w:hdr xmlns:wpc="http://schemas.microsoft.com/office/word/2010/wordprocessingCanvas" xmlns:cx="http://schemas.microsoft.com/office/drawing/2014/chartex" xmlns:cx1="http://schemas.microsoft.com/office/drawing/2015/9/8/chartex" xmlns:cx2="http://schemas.microsoft.com/office/drawing/2015/10/21/chartex" xmlns:cx3="http://schemas.microsoft.com/office/drawing/2016/5/9/chartex" xmlns:cx4="http://schemas.microsoft.com/office/drawing/2016/5/10/chartex" xmlns:cx5="http://schemas.microsoft.com/office/drawing/2016/5/11/chartex" xmlns:cx6="http://schemas.microsoft.com/office/drawing/2016/5/12/chartex" xmlns:cx7="http://schemas.microsoft.com/office/drawing/2016/5/13/chartex" xmlns:cx8="http://schemas.microsoft.com/office/drawing/2016/5/14/chartex" xmlns:mc="http://schemas.openxmlformats.org/markup-compatibility/2006" xmlns:aink="http://schemas.microsoft.com/office/drawing/2016/ink" xmlns:am3d="http://schemas.microsoft.com/office/drawing/2017/model3d" xmlns:o="urn:schemas-microsoft-com:office:office" xmlns:oel="http://schemas.microsoft.com/office/2019/extlst" xmlns:r="http://schemas.openxmlformats.org/officeDocument/2006/relationships" xmlns:m="http://schemas.openxmlformats.org/officeDocument/2006/math" xmlns:v="urn:schemas-microsoft-com:vml" xmlns:wp14="http://schemas.microsoft.com/office/word/2010/wordprocessingDrawing" xmlns:wp="http://schemas.openxmlformats.org/drawingml/2006/wordprocessingDrawing" xmlns:w10="urn:schemas-microsoft-com:office:word" xmlns:w="http://schemas.openxmlformats.org/wordprocessingml/2006/main" xmlns:w14="http://schemas.microsoft.com/office/word/2010/wordml" xmlns:w15="http://schemas.microsoft.com/office/word/2012/wordml" xmlns:w16cex="http://schemas.microsoft.com/office/word/2018/wordml/cex" xmlns:w16cid="http://schemas.microsoft.com/office/word/2016/wordml/cid" xmlns:w16="http://schemas.microsoft.com/office/word/2018/wordml" xmlns:w16du="http://schemas.microsoft.com/office/word/2023/wordml/word16du" xmlns:w16sdtdh="http://schemas.microsoft.com/office/word/2020/wordml/sdtdatahash" xmlns:w16sdtfl="http://schemas.microsoft.com/office/word/2024/wordml/sdtformatlock" xmlns:w16se="http://schemas.microsoft.com/office/word/2015/wordml/symex" xmlns:wpg="http://schemas.microsoft.com/office/word/2010/wordprocessingGroup" xmlns:wpi="http://schemas.microsoft.com/office/word/2010/wordprocessingInk" xmlns:wne="http://schemas.microsoft.com/office/word/2006/wordml" xmlns:wps="http://schemas.microsoft.com/office/word/2010/wordprocessingShape" mc:Ignorable="w14 w15 w16se w16cid w16 w16cex w16sdtdh w16sdtfl w16du wp14">
   <w:p>
     <w:pPr>
-      <w:pStyle w:val="Header"/>
+      <w:pStyle w:val="En-tte"/>
     </w:pPr>
   </w:p>
 </w:hdr>
@@ -2314,7 +2136,7 @@
 <w:hdr xmlns:wpc="http://schemas.microsoft.com/office/word/2010/wordprocessingCanvas" xmlns:cx="http://schemas.microsoft.com/office/drawing/2014/chartex" xmlns:cx1="http://schemas.microsoft.com/office/drawing/2015/9/8/chartex" xmlns:cx2="http://schemas.microsoft.com/office/drawing/2015/10/21/chartex" xmlns:cx3="http://schemas.microsoft.com/office/drawing/2016/5/9/chartex" xmlns:cx4="http://schemas.microsoft.com/office/drawing/2016/5/10/chartex" xmlns:cx5="http://schemas.microsoft.com/office/drawing/2016/5/11/chartex" xmlns:cx6="http://schemas.microsoft.com/office/drawing/2016/5/12/chartex" xmlns:cx7="http://schemas.microsoft.com/office/drawing/2016/5/13/chartex" xmlns:cx8="http://schemas.microsoft.com/office/drawing/2016/5/14/chartex" xmlns:mc="http://schemas.openxmlformats.org/markup-compatibility/2006" xmlns:aink="http://schemas.microsoft.com/office/drawing/2016/ink" xmlns:am3d="http://schemas.microsoft.com/office/drawing/2017/model3d" xmlns:o="urn:schemas-microsoft-com:office:office" xmlns:oel="http://schemas.microsoft.com/office/2019/extlst" xmlns:r="http://schemas.openxmlformats.org/officeDocument/2006/relationships" xmlns:m="http://schemas.openxmlformats.org/officeDocument/2006/math" xmlns:v="urn:schemas-microsoft-com:vml" xmlns:wp14="http://schemas.microsoft.com/office/word/2010/wordprocessingDrawing" xmlns:wp="http://schemas.openxmlformats.org/drawingml/2006/wordprocessingDrawing" xmlns:w10="urn:schemas-microsoft-com:office:word" xmlns:w="http://schemas.openxmlformats.org/wordprocessingml/2006/main" xmlns:w14="http://schemas.microsoft.com/office/word/2010/wordml" xmlns:w15="http://schemas.microsoft.com/office/word/2012/wordml" xmlns:w16cex="http://schemas.microsoft.com/office/word/2018/wordml/cex" xmlns:w16cid="http://schemas.microsoft.com/office/word/2016/wordml/cid" xmlns:w16="http://schemas.microsoft.com/office/word/2018/wordml" xmlns:w16du="http://schemas.microsoft.com/office/word/2023/wordml/word16du" xmlns:w16sdtdh="http://schemas.microsoft.com/office/word/2020/wordml/sdtdatahash" xmlns:w16sdtfl="http://schemas.microsoft.com/office/word/2024/wordml/sdtformatlock" xmlns:w16se="http://schemas.microsoft.com/office/word/2015/wordml/symex" xmlns:wpg="http://schemas.microsoft.com/office/word/2010/wordprocessingGroup" xmlns:wpi="http://schemas.microsoft.com/office/word/2010/wordprocessingInk" xmlns:wne="http://schemas.microsoft.com/office/word/2006/wordml" xmlns:wps="http://schemas.microsoft.com/office/word/2010/wordprocessingShape" mc:Ignorable="w14 w15 w16se w16cid w16 w16cex w16sdtdh w16sdtfl w16du wp14">
   <w:p>
     <w:pPr>
-      <w:pStyle w:val="Header"/>
+      <w:pStyle w:val="En-tte"/>
     </w:pPr>
   </w:p>
 </w:hdr>
@@ -2324,7 +2146,7 @@
 <w:hdr xmlns:wpc="http://schemas.microsoft.com/office/word/2010/wordprocessingCanvas" xmlns:cx="http://schemas.microsoft.com/office/drawing/2014/chartex" xmlns:cx1="http://schemas.microsoft.com/office/drawing/2015/9/8/chartex" xmlns:cx2="http://schemas.microsoft.com/office/drawing/2015/10/21/chartex" xmlns:cx3="http://schemas.microsoft.com/office/drawing/2016/5/9/chartex" xmlns:cx4="http://schemas.microsoft.com/office/drawing/2016/5/10/chartex" xmlns:cx5="http://schemas.microsoft.com/office/drawing/2016/5/11/chartex" xmlns:cx6="http://schemas.microsoft.com/office/drawing/2016/5/12/chartex" xmlns:cx7="http://schemas.microsoft.com/office/drawing/2016/5/13/chartex" xmlns:cx8="http://schemas.microsoft.com/office/drawing/2016/5/14/chartex" xmlns:mc="http://schemas.openxmlformats.org/markup-compatibility/2006" xmlns:aink="http://schemas.microsoft.com/office/drawing/2016/ink" xmlns:am3d="http://schemas.microsoft.com/office/drawing/2017/model3d" xmlns:o="urn:schemas-microsoft-com:office:office" xmlns:oel="http://schemas.microsoft.com/office/2019/extlst" xmlns:r="http://schemas.openxmlformats.org/officeDocument/2006/relationships" xmlns:m="http://schemas.openxmlformats.org/officeDocument/2006/math" xmlns:v="urn:schemas-microsoft-com:vml" xmlns:wp14="http://schemas.microsoft.com/office/word/2010/wordprocessingDrawing" xmlns:wp="http://schemas.openxmlformats.org/drawingml/2006/wordprocessingDrawing" xmlns:w10="urn:schemas-microsoft-com:office:word" xmlns:w="http://schemas.openxmlformats.org/wordprocessingml/2006/main" xmlns:w14="http://schemas.microsoft.com/office/word/2010/wordml" xmlns:w15="http://schemas.microsoft.com/office/word/2012/wordml" xmlns:w16cex="http://schemas.microsoft.com/office/word/2018/wordml/cex" xmlns:w16cid="http://schemas.microsoft.com/office/word/2016/wordml/cid" xmlns:w16="http://schemas.microsoft.com/office/word/2018/wordml" xmlns:w16du="http://schemas.microsoft.com/office/word/2023/wordml/word16du" xmlns:w16sdtdh="http://schemas.microsoft.com/office/word/2020/wordml/sdtdatahash" xmlns:w16sdtfl="http://schemas.microsoft.com/office/word/2024/wordml/sdtformatlock" xmlns:w16se="http://schemas.microsoft.com/office/word/2015/wordml/symex" xmlns:wpg="http://schemas.microsoft.com/office/word/2010/wordprocessingGroup" xmlns:wpi="http://schemas.microsoft.com/office/word/2010/wordprocessingInk" xmlns:wne="http://schemas.microsoft.com/office/word/2006/wordml" xmlns:wps="http://schemas.microsoft.com/office/word/2010/wordprocessingShape" mc:Ignorable="w14 w15 w16se w16cid w16 w16cex w16sdtdh w16sdtfl w16du wp14">
   <w:p>
     <w:pPr>
-      <w:pStyle w:val="Header"/>
+      <w:pStyle w:val="En-tte"/>
     </w:pPr>
   </w:p>
 </w:hdr>
@@ -3369,11 +3191,11 @@
     <w:qFormat/>
     <w:rsid w:val="00393904"/>
   </w:style>
-  <w:style w:type="paragraph" w:styleId="Heading1">
+  <w:style w:type="paragraph" w:styleId="Titre1">
     <w:name w:val="heading 1"/>
     <w:basedOn w:val="Normal"/>
     <w:next w:val="Normal"/>
-    <w:link w:val="Heading1Char"/>
+    <w:link w:val="Titre1Car"/>
     <w:uiPriority w:val="9"/>
     <w:qFormat/>
     <w:rsid w:val="00A179B6"/>
@@ -3390,11 +3212,11 @@
       <w:szCs w:val="40"/>
     </w:rPr>
   </w:style>
-  <w:style w:type="paragraph" w:styleId="Heading2">
+  <w:style w:type="paragraph" w:styleId="Titre2">
     <w:name w:val="heading 2"/>
     <w:basedOn w:val="Normal"/>
     <w:next w:val="Normal"/>
-    <w:link w:val="Heading2Char"/>
+    <w:link w:val="Titre2Car"/>
     <w:uiPriority w:val="9"/>
     <w:semiHidden/>
     <w:unhideWhenUsed/>
@@ -3413,11 +3235,11 @@
       <w:szCs w:val="32"/>
     </w:rPr>
   </w:style>
-  <w:style w:type="paragraph" w:styleId="Heading3">
+  <w:style w:type="paragraph" w:styleId="Titre3">
     <w:name w:val="heading 3"/>
     <w:basedOn w:val="Normal"/>
     <w:next w:val="Normal"/>
-    <w:link w:val="Heading3Char"/>
+    <w:link w:val="Titre3Car"/>
     <w:uiPriority w:val="9"/>
     <w:semiHidden/>
     <w:unhideWhenUsed/>
@@ -3436,11 +3258,11 @@
       <w:szCs w:val="28"/>
     </w:rPr>
   </w:style>
-  <w:style w:type="paragraph" w:styleId="Heading4">
+  <w:style w:type="paragraph" w:styleId="Titre4">
     <w:name w:val="heading 4"/>
     <w:basedOn w:val="Normal"/>
     <w:next w:val="Normal"/>
-    <w:link w:val="Heading4Char"/>
+    <w:link w:val="Titre4Car"/>
     <w:uiPriority w:val="9"/>
     <w:semiHidden/>
     <w:unhideWhenUsed/>
@@ -3459,11 +3281,11 @@
       <w:color w:val="2F5496" w:themeColor="accent1" w:themeShade="BF"/>
     </w:rPr>
   </w:style>
-  <w:style w:type="paragraph" w:styleId="Heading5">
+  <w:style w:type="paragraph" w:styleId="Titre5">
     <w:name w:val="heading 5"/>
     <w:basedOn w:val="Normal"/>
     <w:next w:val="Normal"/>
-    <w:link w:val="Heading5Char"/>
+    <w:link w:val="Titre5Car"/>
     <w:uiPriority w:val="9"/>
     <w:semiHidden/>
     <w:unhideWhenUsed/>
@@ -3480,11 +3302,11 @@
       <w:color w:val="2F5496" w:themeColor="accent1" w:themeShade="BF"/>
     </w:rPr>
   </w:style>
-  <w:style w:type="paragraph" w:styleId="Heading6">
+  <w:style w:type="paragraph" w:styleId="Titre6">
     <w:name w:val="heading 6"/>
     <w:basedOn w:val="Normal"/>
     <w:next w:val="Normal"/>
-    <w:link w:val="Heading6Char"/>
+    <w:link w:val="Titre6Car"/>
     <w:uiPriority w:val="9"/>
     <w:semiHidden/>
     <w:unhideWhenUsed/>
@@ -3503,11 +3325,11 @@
       <w:color w:val="595959" w:themeColor="text1" w:themeTint="A6"/>
     </w:rPr>
   </w:style>
-  <w:style w:type="paragraph" w:styleId="Heading7">
+  <w:style w:type="paragraph" w:styleId="Titre7">
     <w:name w:val="heading 7"/>
     <w:basedOn w:val="Normal"/>
     <w:next w:val="Normal"/>
-    <w:link w:val="Heading7Char"/>
+    <w:link w:val="Titre7Car"/>
     <w:uiPriority w:val="9"/>
     <w:semiHidden/>
     <w:unhideWhenUsed/>
@@ -3524,11 +3346,11 @@
       <w:color w:val="595959" w:themeColor="text1" w:themeTint="A6"/>
     </w:rPr>
   </w:style>
-  <w:style w:type="paragraph" w:styleId="Heading8">
+  <w:style w:type="paragraph" w:styleId="Titre8">
     <w:name w:val="heading 8"/>
     <w:basedOn w:val="Normal"/>
     <w:next w:val="Normal"/>
-    <w:link w:val="Heading8Char"/>
+    <w:link w:val="Titre8Car"/>
     <w:uiPriority w:val="9"/>
     <w:semiHidden/>
     <w:unhideWhenUsed/>
@@ -3547,11 +3369,11 @@
       <w:color w:val="272727" w:themeColor="text1" w:themeTint="D8"/>
     </w:rPr>
   </w:style>
-  <w:style w:type="paragraph" w:styleId="Heading9">
+  <w:style w:type="paragraph" w:styleId="Titre9">
     <w:name w:val="heading 9"/>
     <w:basedOn w:val="Normal"/>
     <w:next w:val="Normal"/>
-    <w:link w:val="Heading9Char"/>
+    <w:link w:val="Titre9Car"/>
     <w:uiPriority w:val="9"/>
     <w:semiHidden/>
     <w:unhideWhenUsed/>
@@ -3568,13 +3390,13 @@
       <w:color w:val="272727" w:themeColor="text1" w:themeTint="D8"/>
     </w:rPr>
   </w:style>
-  <w:style w:type="character" w:default="1" w:styleId="DefaultParagraphFont">
+  <w:style w:type="character" w:default="1" w:styleId="Policepardfaut">
     <w:name w:val="Default Paragraph Font"/>
     <w:uiPriority w:val="1"/>
     <w:semiHidden/>
     <w:unhideWhenUsed/>
   </w:style>
-  <w:style w:type="table" w:default="1" w:styleId="TableNormal">
+  <w:style w:type="table" w:default="1" w:styleId="TableauNormal">
     <w:name w:val="Normal Table"/>
     <w:uiPriority w:val="99"/>
     <w:semiHidden/>
@@ -3589,16 +3411,16 @@
       </w:tblCellMar>
     </w:tblPr>
   </w:style>
-  <w:style w:type="numbering" w:default="1" w:styleId="NoList">
+  <w:style w:type="numbering" w:default="1" w:styleId="Aucuneliste">
     <w:name w:val="No List"/>
     <w:uiPriority w:val="99"/>
     <w:semiHidden/>
     <w:unhideWhenUsed/>
   </w:style>
-  <w:style w:type="character" w:customStyle="1" w:styleId="Heading1Char">
-    <w:name w:val="Heading 1 Char"/>
-    <w:basedOn w:val="DefaultParagraphFont"/>
-    <w:link w:val="Heading1"/>
+  <w:style w:type="character" w:customStyle="1" w:styleId="Titre1Car">
+    <w:name w:val="Titre 1 Car"/>
+    <w:basedOn w:val="Policepardfaut"/>
+    <w:link w:val="Titre1"/>
     <w:uiPriority w:val="9"/>
     <w:rsid w:val="00A179B6"/>
     <w:rPr>
@@ -3608,10 +3430,10 @@
       <w:szCs w:val="40"/>
     </w:rPr>
   </w:style>
-  <w:style w:type="character" w:customStyle="1" w:styleId="Heading2Char">
-    <w:name w:val="Heading 2 Char"/>
-    <w:basedOn w:val="DefaultParagraphFont"/>
-    <w:link w:val="Heading2"/>
+  <w:style w:type="character" w:customStyle="1" w:styleId="Titre2Car">
+    <w:name w:val="Titre 2 Car"/>
+    <w:basedOn w:val="Policepardfaut"/>
+    <w:link w:val="Titre2"/>
     <w:uiPriority w:val="9"/>
     <w:semiHidden/>
     <w:rsid w:val="00A179B6"/>
@@ -3622,10 +3444,10 @@
       <w:szCs w:val="32"/>
     </w:rPr>
   </w:style>
-  <w:style w:type="character" w:customStyle="1" w:styleId="Heading3Char">
-    <w:name w:val="Heading 3 Char"/>
-    <w:basedOn w:val="DefaultParagraphFont"/>
-    <w:link w:val="Heading3"/>
+  <w:style w:type="character" w:customStyle="1" w:styleId="Titre3Car">
+    <w:name w:val="Titre 3 Car"/>
+    <w:basedOn w:val="Policepardfaut"/>
+    <w:link w:val="Titre3"/>
     <w:uiPriority w:val="9"/>
     <w:semiHidden/>
     <w:rsid w:val="00A179B6"/>
@@ -3636,10 +3458,10 @@
       <w:szCs w:val="28"/>
     </w:rPr>
   </w:style>
-  <w:style w:type="character" w:customStyle="1" w:styleId="Heading4Char">
-    <w:name w:val="Heading 4 Char"/>
-    <w:basedOn w:val="DefaultParagraphFont"/>
-    <w:link w:val="Heading4"/>
+  <w:style w:type="character" w:customStyle="1" w:styleId="Titre4Car">
+    <w:name w:val="Titre 4 Car"/>
+    <w:basedOn w:val="Policepardfaut"/>
+    <w:link w:val="Titre4"/>
     <w:uiPriority w:val="9"/>
     <w:semiHidden/>
     <w:rsid w:val="00A179B6"/>
@@ -3650,10 +3472,10 @@
       <w:color w:val="2F5496" w:themeColor="accent1" w:themeShade="BF"/>
     </w:rPr>
   </w:style>
-  <w:style w:type="character" w:customStyle="1" w:styleId="Heading5Char">
-    <w:name w:val="Heading 5 Char"/>
-    <w:basedOn w:val="DefaultParagraphFont"/>
-    <w:link w:val="Heading5"/>
+  <w:style w:type="character" w:customStyle="1" w:styleId="Titre5Car">
+    <w:name w:val="Titre 5 Car"/>
+    <w:basedOn w:val="Policepardfaut"/>
+    <w:link w:val="Titre5"/>
     <w:uiPriority w:val="9"/>
     <w:semiHidden/>
     <w:rsid w:val="00A179B6"/>
@@ -3662,10 +3484,10 @@
       <w:color w:val="2F5496" w:themeColor="accent1" w:themeShade="BF"/>
     </w:rPr>
   </w:style>
-  <w:style w:type="character" w:customStyle="1" w:styleId="Heading6Char">
-    <w:name w:val="Heading 6 Char"/>
-    <w:basedOn w:val="DefaultParagraphFont"/>
-    <w:link w:val="Heading6"/>
+  <w:style w:type="character" w:customStyle="1" w:styleId="Titre6Car">
+    <w:name w:val="Titre 6 Car"/>
+    <w:basedOn w:val="Policepardfaut"/>
+    <w:link w:val="Titre6"/>
     <w:uiPriority w:val="9"/>
     <w:semiHidden/>
     <w:rsid w:val="00A179B6"/>
@@ -3676,10 +3498,10 @@
       <w:color w:val="595959" w:themeColor="text1" w:themeTint="A6"/>
     </w:rPr>
   </w:style>
-  <w:style w:type="character" w:customStyle="1" w:styleId="Heading7Char">
-    <w:name w:val="Heading 7 Char"/>
-    <w:basedOn w:val="DefaultParagraphFont"/>
-    <w:link w:val="Heading7"/>
+  <w:style w:type="character" w:customStyle="1" w:styleId="Titre7Car">
+    <w:name w:val="Titre 7 Car"/>
+    <w:basedOn w:val="Policepardfaut"/>
+    <w:link w:val="Titre7"/>
     <w:uiPriority w:val="9"/>
     <w:semiHidden/>
     <w:rsid w:val="00A179B6"/>
@@ -3688,10 +3510,10 @@
       <w:color w:val="595959" w:themeColor="text1" w:themeTint="A6"/>
     </w:rPr>
   </w:style>
-  <w:style w:type="character" w:customStyle="1" w:styleId="Heading8Char">
-    <w:name w:val="Heading 8 Char"/>
-    <w:basedOn w:val="DefaultParagraphFont"/>
-    <w:link w:val="Heading8"/>
+  <w:style w:type="character" w:customStyle="1" w:styleId="Titre8Car">
+    <w:name w:val="Titre 8 Car"/>
+    <w:basedOn w:val="Policepardfaut"/>
+    <w:link w:val="Titre8"/>
     <w:uiPriority w:val="9"/>
     <w:semiHidden/>
     <w:rsid w:val="00A179B6"/>
@@ -3702,10 +3524,10 @@
       <w:color w:val="272727" w:themeColor="text1" w:themeTint="D8"/>
     </w:rPr>
   </w:style>
-  <w:style w:type="character" w:customStyle="1" w:styleId="Heading9Char">
-    <w:name w:val="Heading 9 Char"/>
-    <w:basedOn w:val="DefaultParagraphFont"/>
-    <w:link w:val="Heading9"/>
+  <w:style w:type="character" w:customStyle="1" w:styleId="Titre9Car">
+    <w:name w:val="Titre 9 Car"/>
+    <w:basedOn w:val="Policepardfaut"/>
+    <w:link w:val="Titre9"/>
     <w:uiPriority w:val="9"/>
     <w:semiHidden/>
     <w:rsid w:val="00A179B6"/>
@@ -3714,11 +3536,11 @@
       <w:color w:val="272727" w:themeColor="text1" w:themeTint="D8"/>
     </w:rPr>
   </w:style>
-  <w:style w:type="paragraph" w:styleId="Title">
+  <w:style w:type="paragraph" w:styleId="Titre">
     <w:name w:val="Title"/>
     <w:basedOn w:val="Normal"/>
     <w:next w:val="Normal"/>
-    <w:link w:val="TitleChar"/>
+    <w:link w:val="TitreCar"/>
     <w:uiPriority w:val="10"/>
     <w:qFormat/>
     <w:rsid w:val="00A179B6"/>
@@ -3734,10 +3556,10 @@
       <w:szCs w:val="56"/>
     </w:rPr>
   </w:style>
-  <w:style w:type="character" w:customStyle="1" w:styleId="TitleChar">
-    <w:name w:val="Title Char"/>
-    <w:basedOn w:val="DefaultParagraphFont"/>
-    <w:link w:val="Title"/>
+  <w:style w:type="character" w:customStyle="1" w:styleId="TitreCar">
+    <w:name w:val="Titre Car"/>
+    <w:basedOn w:val="Policepardfaut"/>
+    <w:link w:val="Titre"/>
     <w:uiPriority w:val="10"/>
     <w:rsid w:val="00A179B6"/>
     <w:rPr>
@@ -3748,11 +3570,11 @@
       <w:szCs w:val="56"/>
     </w:rPr>
   </w:style>
-  <w:style w:type="paragraph" w:styleId="Subtitle">
+  <w:style w:type="paragraph" w:styleId="Sous-titre">
     <w:name w:val="Subtitle"/>
     <w:basedOn w:val="Normal"/>
     <w:next w:val="Normal"/>
-    <w:link w:val="SubtitleChar"/>
+    <w:link w:val="Sous-titreCar"/>
     <w:uiPriority w:val="11"/>
     <w:qFormat/>
     <w:rsid w:val="00A179B6"/>
@@ -3769,10 +3591,10 @@
       <w:szCs w:val="28"/>
     </w:rPr>
   </w:style>
-  <w:style w:type="character" w:customStyle="1" w:styleId="SubtitleChar">
-    <w:name w:val="Subtitle Char"/>
-    <w:basedOn w:val="DefaultParagraphFont"/>
-    <w:link w:val="Subtitle"/>
+  <w:style w:type="character" w:customStyle="1" w:styleId="Sous-titreCar">
+    <w:name w:val="Sous-titre Car"/>
+    <w:basedOn w:val="Policepardfaut"/>
+    <w:link w:val="Sous-titre"/>
     <w:uiPriority w:val="11"/>
     <w:rsid w:val="00A179B6"/>
     <w:rPr>
@@ -3783,11 +3605,11 @@
       <w:szCs w:val="28"/>
     </w:rPr>
   </w:style>
-  <w:style w:type="paragraph" w:styleId="Quote">
+  <w:style w:type="paragraph" w:styleId="Citation">
     <w:name w:val="Quote"/>
     <w:basedOn w:val="Normal"/>
     <w:next w:val="Normal"/>
-    <w:link w:val="QuoteChar"/>
+    <w:link w:val="CitationCar"/>
     <w:uiPriority w:val="29"/>
     <w:qFormat/>
     <w:rsid w:val="00A179B6"/>
@@ -3801,10 +3623,10 @@
       <w:color w:val="404040" w:themeColor="text1" w:themeTint="BF"/>
     </w:rPr>
   </w:style>
-  <w:style w:type="character" w:customStyle="1" w:styleId="QuoteChar">
-    <w:name w:val="Quote Char"/>
-    <w:basedOn w:val="DefaultParagraphFont"/>
-    <w:link w:val="Quote"/>
+  <w:style w:type="character" w:customStyle="1" w:styleId="CitationCar">
+    <w:name w:val="Citation Car"/>
+    <w:basedOn w:val="Policepardfaut"/>
+    <w:link w:val="Citation"/>
     <w:uiPriority w:val="29"/>
     <w:rsid w:val="00A179B6"/>
     <w:rPr>
@@ -3813,7 +3635,7 @@
       <w:color w:val="404040" w:themeColor="text1" w:themeTint="BF"/>
     </w:rPr>
   </w:style>
-  <w:style w:type="paragraph" w:styleId="ListParagraph">
+  <w:style w:type="paragraph" w:styleId="Paragraphedeliste">
     <w:name w:val="List Paragraph"/>
     <w:basedOn w:val="Normal"/>
     <w:uiPriority w:val="34"/>
@@ -3824,9 +3646,9 @@
       <w:contextualSpacing/>
     </w:pPr>
   </w:style>
-  <w:style w:type="character" w:styleId="IntenseEmphasis">
+  <w:style w:type="character" w:styleId="Accentuationintense">
     <w:name w:val="Intense Emphasis"/>
-    <w:basedOn w:val="DefaultParagraphFont"/>
+    <w:basedOn w:val="Policepardfaut"/>
     <w:uiPriority w:val="21"/>
     <w:qFormat/>
     <w:rsid w:val="00A179B6"/>
@@ -3836,11 +3658,11 @@
       <w:color w:val="2F5496" w:themeColor="accent1" w:themeShade="BF"/>
     </w:rPr>
   </w:style>
-  <w:style w:type="paragraph" w:styleId="IntenseQuote">
+  <w:style w:type="paragraph" w:styleId="Citationintense">
     <w:name w:val="Intense Quote"/>
     <w:basedOn w:val="Normal"/>
     <w:next w:val="Normal"/>
-    <w:link w:val="IntenseQuoteChar"/>
+    <w:link w:val="CitationintenseCar"/>
     <w:uiPriority w:val="30"/>
     <w:qFormat/>
     <w:rsid w:val="00A179B6"/>
@@ -3859,10 +3681,10 @@
       <w:color w:val="2F5496" w:themeColor="accent1" w:themeShade="BF"/>
     </w:rPr>
   </w:style>
-  <w:style w:type="character" w:customStyle="1" w:styleId="IntenseQuoteChar">
-    <w:name w:val="Intense Quote Char"/>
-    <w:basedOn w:val="DefaultParagraphFont"/>
-    <w:link w:val="IntenseQuote"/>
+  <w:style w:type="character" w:customStyle="1" w:styleId="CitationintenseCar">
+    <w:name w:val="Citation intense Car"/>
+    <w:basedOn w:val="Policepardfaut"/>
+    <w:link w:val="Citationintense"/>
     <w:uiPriority w:val="30"/>
     <w:rsid w:val="00A179B6"/>
     <w:rPr>
@@ -3871,9 +3693,9 @@
       <w:color w:val="2F5496" w:themeColor="accent1" w:themeShade="BF"/>
     </w:rPr>
   </w:style>
-  <w:style w:type="character" w:styleId="IntenseReference">
+  <w:style w:type="character" w:styleId="Rfrenceintense">
     <w:name w:val="Intense Reference"/>
-    <w:basedOn w:val="DefaultParagraphFont"/>
+    <w:basedOn w:val="Policepardfaut"/>
     <w:uiPriority w:val="32"/>
     <w:qFormat/>
     <w:rsid w:val="00A179B6"/>
@@ -3885,10 +3707,10 @@
       <w:spacing w:val="5"/>
     </w:rPr>
   </w:style>
-  <w:style w:type="paragraph" w:styleId="FootnoteText">
+  <w:style w:type="paragraph" w:styleId="Notedebasdepage">
     <w:name w:val="footnote text"/>
     <w:basedOn w:val="Normal"/>
-    <w:link w:val="FootnoteTextChar"/>
+    <w:link w:val="NotedebasdepageCar"/>
     <w:uiPriority w:val="99"/>
     <w:unhideWhenUsed/>
     <w:rsid w:val="00EF4D84"/>
@@ -3902,10 +3724,10 @@
       <w:lang w:val="x-none" w:eastAsia="x-none"/>
     </w:rPr>
   </w:style>
-  <w:style w:type="character" w:customStyle="1" w:styleId="FootnoteTextChar">
-    <w:name w:val="Footnote Text Char"/>
-    <w:basedOn w:val="DefaultParagraphFont"/>
-    <w:link w:val="FootnoteText"/>
+  <w:style w:type="character" w:customStyle="1" w:styleId="NotedebasdepageCar">
+    <w:name w:val="Note de bas de page Car"/>
+    <w:basedOn w:val="Policepardfaut"/>
+    <w:link w:val="Notedebasdepage"/>
     <w:uiPriority w:val="99"/>
     <w:rsid w:val="00EF4D84"/>
     <w:rPr>
@@ -3915,7 +3737,7 @@
       <w:lang w:val="x-none" w:eastAsia="x-none"/>
     </w:rPr>
   </w:style>
-  <w:style w:type="character" w:styleId="FootnoteReference">
+  <w:style w:type="character" w:styleId="Appelnotedebasdep">
     <w:name w:val="footnote reference"/>
     <w:uiPriority w:val="99"/>
     <w:semiHidden/>
@@ -3925,10 +3747,10 @@
       <w:vertAlign w:val="superscript"/>
     </w:rPr>
   </w:style>
-  <w:style w:type="paragraph" w:styleId="Header">
+  <w:style w:type="paragraph" w:styleId="En-tte">
     <w:name w:val="header"/>
     <w:basedOn w:val="Normal"/>
-    <w:link w:val="HeaderChar"/>
+    <w:link w:val="En-tteCar"/>
     <w:uiPriority w:val="99"/>
     <w:unhideWhenUsed/>
     <w:rsid w:val="00EF4D84"/>
@@ -3940,17 +3762,17 @@
       <w:spacing w:after="0" w:line="240" w:lineRule="auto"/>
     </w:pPr>
   </w:style>
-  <w:style w:type="character" w:customStyle="1" w:styleId="HeaderChar">
-    <w:name w:val="Header Char"/>
-    <w:basedOn w:val="DefaultParagraphFont"/>
-    <w:link w:val="Header"/>
+  <w:style w:type="character" w:customStyle="1" w:styleId="En-tteCar">
+    <w:name w:val="En-tête Car"/>
+    <w:basedOn w:val="Policepardfaut"/>
+    <w:link w:val="En-tte"/>
     <w:uiPriority w:val="99"/>
     <w:rsid w:val="00EF4D84"/>
   </w:style>
-  <w:style w:type="paragraph" w:styleId="Footer">
+  <w:style w:type="paragraph" w:styleId="Pieddepage">
     <w:name w:val="footer"/>
     <w:basedOn w:val="Normal"/>
-    <w:link w:val="FooterChar"/>
+    <w:link w:val="PieddepageCar"/>
     <w:uiPriority w:val="99"/>
     <w:unhideWhenUsed/>
     <w:rsid w:val="00EF4D84"/>
@@ -3962,16 +3784,16 @@
       <w:spacing w:after="0" w:line="240" w:lineRule="auto"/>
     </w:pPr>
   </w:style>
-  <w:style w:type="character" w:customStyle="1" w:styleId="FooterChar">
-    <w:name w:val="Footer Char"/>
-    <w:basedOn w:val="DefaultParagraphFont"/>
-    <w:link w:val="Footer"/>
+  <w:style w:type="character" w:customStyle="1" w:styleId="PieddepageCar">
+    <w:name w:val="Pied de page Car"/>
+    <w:basedOn w:val="Policepardfaut"/>
+    <w:link w:val="Pieddepage"/>
     <w:uiPriority w:val="99"/>
     <w:rsid w:val="00EF4D84"/>
   </w:style>
-  <w:style w:type="table" w:styleId="TableGrid">
+  <w:style w:type="table" w:styleId="Grilledutableau">
     <w:name w:val="Table Grid"/>
-    <w:basedOn w:val="TableNormal"/>
+    <w:basedOn w:val="TableauNormal"/>
     <w:uiPriority w:val="39"/>
     <w:rsid w:val="003E66F8"/>
     <w:pPr>

</xml_diff>

<commit_message>
auto: push changes 2026-09-16_09-22-06,22
</commit_message>
<xml_diff>
--- a/Generateur Des Factures/Factures/Facture numéro 18-2026.docx
+++ b/Generateur Des Factures/Factures/Facture numéro 18-2026.docx
@@ -62,6 +62,10 @@
               </w:rPr>
               <w:t>Facture numéro :  18/2026</w:t>
             </w:r>
+            <w:proofErr w:type="gramStart"/>
+            <w:proofErr w:type="gramEnd"/>
+            <w:proofErr w:type="spellStart"/>
+            <w:proofErr w:type="spellEnd"/>
           </w:p>
         </w:tc>
       </w:tr>
@@ -108,34 +112,10 @@
                 <w:szCs w:val="24"/>
                 <w:lang w:val="fr-FR" w:eastAsia="fr-MA"/>
               </w:rPr>
-              <w:t>Date : 1</w:t>
-            </w:r>
-            <w:r>
-              <w:rPr>
-                <w:rFonts w:ascii="Aptos" w:eastAsia="Times New Roman" w:hAnsi="Aptos" w:cs="Arial"/>
-                <w:b/>
-                <w:bCs/>
-                <w:color w:val="000000"/>
-                <w:kern w:val="24"/>
-                <w:sz w:val="24"/>
-                <w:szCs w:val="24"/>
-                <w:lang w:val="fr-FR" w:eastAsia="fr-MA"/>
-              </w:rPr>
-              <w:t>7</w:t>
-            </w:r>
-            <w:r>
-              <w:rPr>
-                <w:rFonts w:ascii="Aptos" w:eastAsia="Times New Roman" w:hAnsi="Aptos" w:cs="Arial"/>
-                <w:b/>
-                <w:bCs/>
-                <w:color w:val="000000"/>
-                <w:kern w:val="24"/>
-                <w:sz w:val="24"/>
-                <w:szCs w:val="24"/>
-                <w:lang w:val="fr-FR" w:eastAsia="fr-MA"/>
-              </w:rPr>
-              <w:t>/09/2026</w:t>
-            </w:r>
+              <w:t>Date : 15/09/2026</w:t>
+            </w:r>
+            <w:proofErr w:type="spellStart"/>
+            <w:proofErr w:type="spellEnd"/>
           </w:p>
         </w:tc>
       </w:tr>
@@ -211,6 +191,7 @@
             </wp14:sizeRelV>
           </wp:anchor>
         </w:drawing>
+        <w:t/>
       </w:r>
     </w:p>
     <w:p>
@@ -251,7 +232,7 @@
     </w:p>
     <w:tbl>
       <w:tblPr>
-        <w:tblStyle w:val="Grilledutableau"/>
+        <w:tblStyle w:val="TableGrid"/>
         <w:tblpPr w:leftFromText="180" w:rightFromText="180" w:vertAnchor="text" w:horzAnchor="page" w:tblpX="661" w:tblpY="318"/>
         <w:tblW w:w="9180" w:type="dxa"/>
         <w:tblBorders>
@@ -286,7 +267,6 @@
                 <w:szCs w:val="28"/>
               </w:rPr>
             </w:pPr>
-            <w:proofErr w:type="spellStart"/>
             <w:r>
               <w:rPr>
                 <w:rFonts w:ascii="Aptos" w:eastAsia="+mn-ea" w:hAnsi="Aptos" w:cs="+mn-cs"/>
@@ -297,21 +277,10 @@
                 <w:sz w:val="28"/>
                 <w:szCs w:val="28"/>
               </w:rPr>
-              <w:t>Evix</w:t>
-            </w:r>
+              <w:t>Evix management</w:t>
+            </w:r>
+            <w:proofErr w:type="spellStart"/>
             <w:proofErr w:type="spellEnd"/>
-            <w:r>
-              <w:rPr>
-                <w:rFonts w:ascii="Aptos" w:eastAsia="+mn-ea" w:hAnsi="Aptos" w:cs="+mn-cs"/>
-                <w:b/>
-                <w:bCs/>
-                <w:color w:val="000000"/>
-                <w:kern w:val="24"/>
-                <w:sz w:val="28"/>
-                <w:szCs w:val="28"/>
-              </w:rPr>
-              <w:t xml:space="preserve"> management</w:t>
-            </w:r>
           </w:p>
           <w:p>
             <w:pPr>
@@ -394,32 +363,10 @@
                 <w:szCs w:val="24"/>
                 <w:lang w:val="fr-FR"/>
               </w:rPr>
-              <w:t xml:space="preserve">Rue tafetacht </w:t>
+              <w:t>Rue tafetacht spaces la rocade Rabat</w:t>
             </w:r>
             <w:proofErr w:type="spellStart"/>
-            <w:r>
-              <w:rPr>
-                <w:rFonts w:ascii="Aptos" w:eastAsia="+mn-ea" w:hAnsi="Aptos" w:cs="+mn-cs"/>
-                <w:color w:val="000000"/>
-                <w:kern w:val="24"/>
-                <w:sz w:val="24"/>
-                <w:szCs w:val="24"/>
-                <w:lang w:val="fr-FR"/>
-              </w:rPr>
-              <w:t>spaces</w:t>
-            </w:r>
             <w:proofErr w:type="spellEnd"/>
-            <w:r>
-              <w:rPr>
-                <w:rFonts w:ascii="Aptos" w:eastAsia="+mn-ea" w:hAnsi="Aptos" w:cs="+mn-cs"/>
-                <w:color w:val="000000"/>
-                <w:kern w:val="24"/>
-                <w:sz w:val="24"/>
-                <w:szCs w:val="24"/>
-                <w:lang w:val="fr-FR"/>
-              </w:rPr>
-              <w:t xml:space="preserve"> la rocade Rabat</w:t>
-            </w:r>
           </w:p>
         </w:tc>
       </w:tr>
@@ -451,6 +398,8 @@
               </w:rPr>
               <w:t>ICE : 001559299000031</w:t>
             </w:r>
+            <w:proofErr w:type="spellStart"/>
+            <w:proofErr w:type="spellEnd"/>
           </w:p>
         </w:tc>
       </w:tr>
@@ -847,27 +796,6 @@
               </w:rPr>
               <w:t xml:space="preserve">• Habilitation électrique </w:t>
             </w:r>
-          </w:p>
-          <w:p>
-            <w:pPr>
-              <w:spacing w:after="0" w:line="240" w:lineRule="auto"/>
-              <w:ind w:left="120"/>
-              <w:rPr>
-                <w:rFonts w:ascii="Arial" w:eastAsia="Times New Roman" w:hAnsi="Arial" w:cs="Arial"/>
-                <w:sz w:val="24"/>
-                <w:szCs w:val="24"/>
-                <w:lang w:val="fr-FR" w:eastAsia="fr-MA"/>
-              </w:rPr>
-            </w:pPr>
-            <w:r>
-              <w:rPr>
-                <w:rFonts w:ascii="Arial" w:eastAsia="Times New Roman" w:hAnsi="Arial" w:cs="Arial"/>
-                <w:sz w:val="24"/>
-                <w:szCs w:val="24"/>
-                <w:lang w:val="fr-FR" w:eastAsia="fr-MA"/>
-              </w:rPr>
-              <w:t xml:space="preserve"> </w:t>
-            </w:r>
             <w:r>
               <w:rPr>
                 <w:rFonts w:ascii="Arial" w:eastAsia="Times New Roman" w:hAnsi="Arial" w:cs="Arial"/>
@@ -877,7 +805,7 @@
                 <w:szCs w:val="20"/>
                 <w:lang w:eastAsia="fr-MA"/>
               </w:rPr>
-              <w:t>Les 14, 15, 16, 17 Septembre 2026</w:t>
+              <w:t/>
             </w:r>
           </w:p>
           <w:p>
@@ -900,6 +828,17 @@
               </w:rPr>
               <w:t xml:space="preserve"> </w:t>
             </w:r>
+            <w:r>
+              <w:rPr>
+                <w:rFonts w:ascii="Arial" w:eastAsia="Times New Roman" w:hAnsi="Arial" w:cs="Arial"/>
+                <w:b/>
+                <w:bCs/>
+                <w:sz w:val="20"/>
+                <w:szCs w:val="20"/>
+                <w:lang w:eastAsia="fr-MA"/>
+              </w:rPr>
+              <w:t>Les 14, 15 septembre 2026</w:t>
+            </w:r>
           </w:p>
           <w:p>
             <w:pPr>
@@ -921,6 +860,17 @@
               </w:rPr>
               <w:t xml:space="preserve"> </w:t>
             </w:r>
+            <w:r>
+              <w:rPr>
+                <w:rFonts w:ascii="Arial" w:eastAsia="Times New Roman" w:hAnsi="Arial" w:cs="Arial"/>
+                <w:b/>
+                <w:bCs/>
+                <w:sz w:val="20"/>
+                <w:szCs w:val="20"/>
+                <w:lang w:eastAsia="fr-MA"/>
+              </w:rPr>
+              <w:t/>
+            </w:r>
           </w:p>
           <w:p>
             <w:pPr>
@@ -941,6 +891,49 @@
                 <w:lang w:val="fr-FR" w:eastAsia="fr-MA"/>
               </w:rPr>
               <w:t xml:space="preserve"> </w:t>
+            </w:r>
+            <w:r>
+              <w:rPr>
+                <w:rFonts w:ascii="Arial" w:eastAsia="Times New Roman" w:hAnsi="Arial" w:cs="Arial"/>
+                <w:b/>
+                <w:bCs/>
+                <w:sz w:val="20"/>
+                <w:szCs w:val="20"/>
+                <w:lang w:eastAsia="fr-MA"/>
+              </w:rPr>
+              <w:t/>
+            </w:r>
+          </w:p>
+          <w:p>
+            <w:pPr>
+              <w:spacing w:after="0" w:line="240" w:lineRule="auto"/>
+              <w:ind w:left="120"/>
+              <w:rPr>
+                <w:rFonts w:ascii="Arial" w:eastAsia="Times New Roman" w:hAnsi="Arial" w:cs="Arial"/>
+                <w:sz w:val="24"/>
+                <w:szCs w:val="24"/>
+                <w:lang w:val="fr-FR" w:eastAsia="fr-MA"/>
+              </w:rPr>
+            </w:pPr>
+            <w:r>
+              <w:rPr>
+                <w:rFonts w:ascii="Arial" w:eastAsia="Times New Roman" w:hAnsi="Arial" w:cs="Arial"/>
+                <w:sz w:val="24"/>
+                <w:szCs w:val="24"/>
+                <w:lang w:val="fr-FR" w:eastAsia="fr-MA"/>
+              </w:rPr>
+              <w:t xml:space="preserve"> </w:t>
+            </w:r>
+            <w:r>
+              <w:rPr>
+                <w:rFonts w:ascii="Arial" w:eastAsia="Times New Roman" w:hAnsi="Arial" w:cs="Arial"/>
+                <w:b/>
+                <w:bCs/>
+                <w:sz w:val="20"/>
+                <w:szCs w:val="20"/>
+                <w:lang w:eastAsia="fr-MA"/>
+              </w:rPr>
+              <w:t/>
             </w:r>
           </w:p>
           <w:p>
@@ -1004,7 +997,7 @@
                 <w:szCs w:val="24"/>
                 <w:lang w:val="en-US" w:eastAsia="fr-MA"/>
               </w:rPr>
-              <w:t>4</w:t>
+              <w:t>2</w:t>
             </w:r>
           </w:p>
           <w:p>
@@ -1019,6 +1012,17 @@
                 <w:lang w:val="en-US" w:eastAsia="fr-MA"/>
               </w:rPr>
             </w:pPr>
+            <w:r>
+              <w:rPr>
+                <w:rFonts w:ascii="Aptos" w:eastAsia="Times New Roman" w:hAnsi="Aptos" w:cs="Arial"/>
+                <w:color w:val="000000"/>
+                <w:kern w:val="24"/>
+                <w:sz w:val="24"/>
+                <w:szCs w:val="24"/>
+                <w:lang w:val="en-US" w:eastAsia="fr-MA"/>
+              </w:rPr>
+              <w:t/>
+            </w:r>
           </w:p>
           <w:p>
             <w:pPr>
@@ -1032,6 +1036,17 @@
                 <w:lang w:val="en-US" w:eastAsia="fr-MA"/>
               </w:rPr>
             </w:pPr>
+            <w:r>
+              <w:rPr>
+                <w:rFonts w:ascii="Aptos" w:eastAsia="Times New Roman" w:hAnsi="Aptos" w:cs="Arial"/>
+                <w:color w:val="000000"/>
+                <w:kern w:val="24"/>
+                <w:sz w:val="24"/>
+                <w:szCs w:val="24"/>
+                <w:lang w:val="en-US" w:eastAsia="fr-MA"/>
+              </w:rPr>
+              <w:t/>
+            </w:r>
           </w:p>
           <w:p>
             <w:pPr>
@@ -1045,6 +1060,17 @@
                 <w:lang w:val="en-US" w:eastAsia="fr-MA"/>
               </w:rPr>
             </w:pPr>
+            <w:r>
+              <w:rPr>
+                <w:rFonts w:ascii="Aptos" w:eastAsia="Times New Roman" w:hAnsi="Aptos" w:cs="Arial"/>
+                <w:color w:val="000000"/>
+                <w:kern w:val="24"/>
+                <w:sz w:val="24"/>
+                <w:szCs w:val="24"/>
+                <w:lang w:val="en-US" w:eastAsia="fr-MA"/>
+              </w:rPr>
+              <w:t/>
+            </w:r>
           </w:p>
           <w:p>
             <w:pPr>
@@ -1058,6 +1084,17 @@
                 <w:lang w:val="en-US" w:eastAsia="fr-MA"/>
               </w:rPr>
             </w:pPr>
+            <w:r>
+              <w:rPr>
+                <w:rFonts w:ascii="Aptos" w:eastAsia="Times New Roman" w:hAnsi="Aptos" w:cs="Arial"/>
+                <w:color w:val="000000"/>
+                <w:kern w:val="24"/>
+                <w:sz w:val="24"/>
+                <w:szCs w:val="24"/>
+                <w:lang w:val="en-US" w:eastAsia="fr-MA"/>
+              </w:rPr>
+              <w:t/>
+            </w:r>
           </w:p>
         </w:tc>
         <w:tc>
@@ -1098,7 +1135,7 @@
                 <w:szCs w:val="24"/>
                 <w:lang w:val="en-US" w:eastAsia="fr-MA"/>
               </w:rPr>
-              <w:t>2500</w:t>
+              <w:t>2250</w:t>
             </w:r>
           </w:p>
           <w:p>
@@ -1113,6 +1150,17 @@
                 <w:lang w:val="en-US" w:eastAsia="fr-MA"/>
               </w:rPr>
             </w:pPr>
+            <w:r>
+              <w:rPr>
+                <w:rFonts w:ascii="Aptos" w:eastAsia="Times New Roman" w:hAnsi="Aptos" w:cs="Arial"/>
+                <w:color w:val="000000"/>
+                <w:kern w:val="24"/>
+                <w:sz w:val="24"/>
+                <w:szCs w:val="24"/>
+                <w:lang w:val="en-US" w:eastAsia="fr-MA"/>
+              </w:rPr>
+              <w:t/>
+            </w:r>
           </w:p>
           <w:p>
             <w:pPr>
@@ -1126,6 +1174,17 @@
                 <w:lang w:val="en-US" w:eastAsia="fr-MA"/>
               </w:rPr>
             </w:pPr>
+            <w:r>
+              <w:rPr>
+                <w:rFonts w:ascii="Aptos" w:eastAsia="Times New Roman" w:hAnsi="Aptos" w:cs="Arial"/>
+                <w:color w:val="000000"/>
+                <w:kern w:val="24"/>
+                <w:sz w:val="24"/>
+                <w:szCs w:val="24"/>
+                <w:lang w:val="en-US" w:eastAsia="fr-MA"/>
+              </w:rPr>
+              <w:t/>
+            </w:r>
           </w:p>
           <w:p>
             <w:pPr>
@@ -1139,6 +1198,17 @@
                 <w:lang w:val="en-US" w:eastAsia="fr-MA"/>
               </w:rPr>
             </w:pPr>
+            <w:r>
+              <w:rPr>
+                <w:rFonts w:ascii="Aptos" w:eastAsia="Times New Roman" w:hAnsi="Aptos" w:cs="Arial"/>
+                <w:color w:val="000000"/>
+                <w:kern w:val="24"/>
+                <w:sz w:val="24"/>
+                <w:szCs w:val="24"/>
+                <w:lang w:val="en-US" w:eastAsia="fr-MA"/>
+              </w:rPr>
+              <w:t/>
+            </w:r>
           </w:p>
           <w:p>
             <w:pPr>
@@ -1152,6 +1222,17 @@
                 <w:lang w:val="en-US" w:eastAsia="fr-MA"/>
               </w:rPr>
             </w:pPr>
+            <w:r>
+              <w:rPr>
+                <w:rFonts w:ascii="Aptos" w:eastAsia="Times New Roman" w:hAnsi="Aptos" w:cs="Arial"/>
+                <w:color w:val="000000"/>
+                <w:kern w:val="24"/>
+                <w:sz w:val="24"/>
+                <w:szCs w:val="24"/>
+                <w:lang w:val="en-US" w:eastAsia="fr-MA"/>
+              </w:rPr>
+              <w:t/>
+            </w:r>
           </w:p>
         </w:tc>
         <w:tc>
@@ -1192,7 +1273,7 @@
                 <w:szCs w:val="24"/>
                 <w:lang w:val="en-US" w:eastAsia="fr-MA"/>
               </w:rPr>
-              <w:t>10000</w:t>
+              <w:t>4500</w:t>
             </w:r>
           </w:p>
           <w:p>
@@ -1207,6 +1288,17 @@
                 <w:lang w:val="en-US" w:eastAsia="fr-MA"/>
               </w:rPr>
             </w:pPr>
+            <w:r>
+              <w:rPr>
+                <w:rFonts w:ascii="Aptos" w:eastAsia="Times New Roman" w:hAnsi="Aptos" w:cs="Arial"/>
+                <w:color w:val="000000"/>
+                <w:kern w:val="24"/>
+                <w:sz w:val="24"/>
+                <w:szCs w:val="24"/>
+                <w:lang w:val="en-US" w:eastAsia="fr-MA"/>
+              </w:rPr>
+              <w:t/>
+            </w:r>
           </w:p>
           <w:p>
             <w:pPr>
@@ -1220,6 +1312,17 @@
                 <w:lang w:val="en-US" w:eastAsia="fr-MA"/>
               </w:rPr>
             </w:pPr>
+            <w:r>
+              <w:rPr>
+                <w:rFonts w:ascii="Aptos" w:eastAsia="Times New Roman" w:hAnsi="Aptos" w:cs="Arial"/>
+                <w:color w:val="000000"/>
+                <w:kern w:val="24"/>
+                <w:sz w:val="24"/>
+                <w:szCs w:val="24"/>
+                <w:lang w:val="en-US" w:eastAsia="fr-MA"/>
+              </w:rPr>
+              <w:t/>
+            </w:r>
           </w:p>
           <w:p>
             <w:pPr>
@@ -1233,6 +1336,17 @@
                 <w:lang w:val="en-US" w:eastAsia="fr-MA"/>
               </w:rPr>
             </w:pPr>
+            <w:r>
+              <w:rPr>
+                <w:rFonts w:ascii="Aptos" w:eastAsia="Times New Roman" w:hAnsi="Aptos" w:cs="Arial"/>
+                <w:color w:val="000000"/>
+                <w:kern w:val="24"/>
+                <w:sz w:val="24"/>
+                <w:szCs w:val="24"/>
+                <w:lang w:val="en-US" w:eastAsia="fr-MA"/>
+              </w:rPr>
+              <w:t/>
+            </w:r>
           </w:p>
           <w:p>
             <w:pPr>
@@ -1246,6 +1360,17 @@
                 <w:lang w:val="en-US" w:eastAsia="fr-MA"/>
               </w:rPr>
             </w:pPr>
+            <w:r>
+              <w:rPr>
+                <w:rFonts w:ascii="Aptos" w:eastAsia="Times New Roman" w:hAnsi="Aptos" w:cs="Arial"/>
+                <w:color w:val="000000"/>
+                <w:kern w:val="24"/>
+                <w:sz w:val="24"/>
+                <w:szCs w:val="24"/>
+                <w:lang w:val="en-US" w:eastAsia="fr-MA"/>
+              </w:rPr>
+              <w:t/>
+            </w:r>
           </w:p>
         </w:tc>
       </w:tr>
@@ -1260,16 +1385,16 @@
     </w:p>
     <w:tbl>
       <w:tblPr>
-        <w:tblStyle w:val="Grilledutableau"/>
+        <w:tblStyle w:val="TableGrid"/>
         <w:tblpPr w:leftFromText="141" w:rightFromText="141" w:vertAnchor="text" w:horzAnchor="page" w:tblpX="685" w:tblpY="-17"/>
         <w:tblOverlap w:val="never"/>
         <w:tblW w:w="9776" w:type="dxa"/>
         <w:tblLook w:val="04A0" w:firstRow="1" w:lastRow="0" w:firstColumn="1" w:lastColumn="0" w:noHBand="0" w:noVBand="1"/>
       </w:tblPr>
       <w:tblGrid>
-        <w:gridCol w:w="5382"/>
-        <w:gridCol w:w="3118"/>
-        <w:gridCol w:w="1276"/>
+        <w:gridCol w:w="5027"/>
+        <w:gridCol w:w="2924"/>
+        <w:gridCol w:w="1825"/>
       </w:tblGrid>
       <w:tr>
         <w:tc>
@@ -1314,8 +1439,10 @@
                 <w:kern w:val="24"/>
                 <w:lang w:eastAsia="fr-MA"/>
               </w:rPr>
-              <w:t>10000</w:t>
-            </w:r>
+              <w:t>4500</w:t>
+            </w:r>
+            <w:proofErr w:type="spellStart"/>
+            <w:proofErr w:type="spellEnd"/>
           </w:p>
         </w:tc>
       </w:tr>
@@ -1353,8 +1480,10 @@
               </w:rPr>
             </w:pPr>
             <w:r>
-              <w:t>ARRETE LA PRESENTE FACTURE A LA SOMME DE : #Dix mille dirhams#</w:t>
-            </w:r>
+              <w:t>ARRETE LA PRESENTE FACTURE A LA SOMME DE : #Quatre mille cinq cents dirhams#</w:t>
+            </w:r>
+            <w:proofErr w:type="gramStart"/>
+            <w:proofErr w:type="gramEnd"/>
           </w:p>
           <w:p>
             <w:pPr>
@@ -1382,6 +1511,10 @@
               </w:rPr>
               <w:t>Attijariwafa Bank RIB :  007780000401230040249794</w:t>
             </w:r>
+            <w:proofErr w:type="gramStart"/>
+            <w:proofErr w:type="gramEnd"/>
+            <w:proofErr w:type="spellStart"/>
+            <w:proofErr w:type="spellEnd"/>
           </w:p>
         </w:tc>
       </w:tr>
@@ -1479,6 +1612,7 @@
             </wp14:sizeRelV>
           </wp:anchor>
         </w:drawing>
+        <w:t/>
       </w:r>
       <w:r>
         <w:rPr>
@@ -1536,7 +1670,7 @@
 <w:ftr xmlns:wpc="http://schemas.microsoft.com/office/word/2010/wordprocessingCanvas" xmlns:cx="http://schemas.microsoft.com/office/drawing/2014/chartex" xmlns:cx1="http://schemas.microsoft.com/office/drawing/2015/9/8/chartex" xmlns:cx2="http://schemas.microsoft.com/office/drawing/2015/10/21/chartex" xmlns:cx3="http://schemas.microsoft.com/office/drawing/2016/5/9/chartex" xmlns:cx4="http://schemas.microsoft.com/office/drawing/2016/5/10/chartex" xmlns:cx5="http://schemas.microsoft.com/office/drawing/2016/5/11/chartex" xmlns:cx6="http://schemas.microsoft.com/office/drawing/2016/5/12/chartex" xmlns:cx7="http://schemas.microsoft.com/office/drawing/2016/5/13/chartex" xmlns:cx8="http://schemas.microsoft.com/office/drawing/2016/5/14/chartex" xmlns:mc="http://schemas.openxmlformats.org/markup-compatibility/2006" xmlns:aink="http://schemas.microsoft.com/office/drawing/2016/ink" xmlns:am3d="http://schemas.microsoft.com/office/drawing/2017/model3d" xmlns:o="urn:schemas-microsoft-com:office:office" xmlns:oel="http://schemas.microsoft.com/office/2019/extlst" xmlns:r="http://schemas.openxmlformats.org/officeDocument/2006/relationships" xmlns:m="http://schemas.openxmlformats.org/officeDocument/2006/math" xmlns:v="urn:schemas-microsoft-com:vml" xmlns:wp14="http://schemas.microsoft.com/office/word/2010/wordprocessingDrawing" xmlns:wp="http://schemas.openxmlformats.org/drawingml/2006/wordprocessingDrawing" xmlns:w10="urn:schemas-microsoft-com:office:word" xmlns:w="http://schemas.openxmlformats.org/wordprocessingml/2006/main" xmlns:w14="http://schemas.microsoft.com/office/word/2010/wordml" xmlns:w15="http://schemas.microsoft.com/office/word/2012/wordml" xmlns:w16cex="http://schemas.microsoft.com/office/word/2018/wordml/cex" xmlns:w16cid="http://schemas.microsoft.com/office/word/2016/wordml/cid" xmlns:w16="http://schemas.microsoft.com/office/word/2018/wordml" xmlns:w16du="http://schemas.microsoft.com/office/word/2023/wordml/word16du" xmlns:w16sdtdh="http://schemas.microsoft.com/office/word/2020/wordml/sdtdatahash" xmlns:w16sdtfl="http://schemas.microsoft.com/office/word/2024/wordml/sdtformatlock" xmlns:w16se="http://schemas.microsoft.com/office/word/2015/wordml/symex" xmlns:wpg="http://schemas.microsoft.com/office/word/2010/wordprocessingGroup" xmlns:wpi="http://schemas.microsoft.com/office/word/2010/wordprocessingInk" xmlns:wne="http://schemas.microsoft.com/office/word/2006/wordml" xmlns:wps="http://schemas.microsoft.com/office/word/2010/wordprocessingShape" mc:Ignorable="w14 w15 w16se w16cid w16 w16cex w16sdtdh w16sdtfl w16du wp14">
   <w:p>
     <w:pPr>
-      <w:pStyle w:val="Pieddepage"/>
+      <w:pStyle w:val="Footer"/>
     </w:pPr>
   </w:p>
 </w:ftr>
@@ -1546,7 +1680,7 @@
 <w:ftr xmlns:wpc="http://schemas.microsoft.com/office/word/2010/wordprocessingCanvas" xmlns:cx="http://schemas.microsoft.com/office/drawing/2014/chartex" xmlns:cx1="http://schemas.microsoft.com/office/drawing/2015/9/8/chartex" xmlns:cx2="http://schemas.microsoft.com/office/drawing/2015/10/21/chartex" xmlns:cx3="http://schemas.microsoft.com/office/drawing/2016/5/9/chartex" xmlns:cx4="http://schemas.microsoft.com/office/drawing/2016/5/10/chartex" xmlns:cx5="http://schemas.microsoft.com/office/drawing/2016/5/11/chartex" xmlns:cx6="http://schemas.microsoft.com/office/drawing/2016/5/12/chartex" xmlns:cx7="http://schemas.microsoft.com/office/drawing/2016/5/13/chartex" xmlns:cx8="http://schemas.microsoft.com/office/drawing/2016/5/14/chartex" xmlns:mc="http://schemas.openxmlformats.org/markup-compatibility/2006" xmlns:aink="http://schemas.microsoft.com/office/drawing/2016/ink" xmlns:am3d="http://schemas.microsoft.com/office/drawing/2017/model3d" xmlns:o="urn:schemas-microsoft-com:office:office" xmlns:oel="http://schemas.microsoft.com/office/2019/extlst" xmlns:r="http://schemas.openxmlformats.org/officeDocument/2006/relationships" xmlns:m="http://schemas.openxmlformats.org/officeDocument/2006/math" xmlns:v="urn:schemas-microsoft-com:vml" xmlns:wp14="http://schemas.microsoft.com/office/word/2010/wordprocessingDrawing" xmlns:wp="http://schemas.openxmlformats.org/drawingml/2006/wordprocessingDrawing" xmlns:w10="urn:schemas-microsoft-com:office:word" xmlns:w="http://schemas.openxmlformats.org/wordprocessingml/2006/main" xmlns:w14="http://schemas.microsoft.com/office/word/2010/wordml" xmlns:w15="http://schemas.microsoft.com/office/word/2012/wordml" xmlns:w16cex="http://schemas.microsoft.com/office/word/2018/wordml/cex" xmlns:w16cid="http://schemas.microsoft.com/office/word/2016/wordml/cid" xmlns:w16="http://schemas.microsoft.com/office/word/2018/wordml" xmlns:w16du="http://schemas.microsoft.com/office/word/2023/wordml/word16du" xmlns:w16sdtdh="http://schemas.microsoft.com/office/word/2020/wordml/sdtdatahash" xmlns:w16sdtfl="http://schemas.microsoft.com/office/word/2024/wordml/sdtformatlock" xmlns:w16se="http://schemas.microsoft.com/office/word/2015/wordml/symex" xmlns:wpg="http://schemas.microsoft.com/office/word/2010/wordprocessingGroup" xmlns:wpi="http://schemas.microsoft.com/office/word/2010/wordprocessingInk" xmlns:wne="http://schemas.microsoft.com/office/word/2006/wordml" xmlns:wps="http://schemas.microsoft.com/office/word/2010/wordprocessingShape" mc:Ignorable="w14 w15 w16se w16cid w16 w16cex w16sdtdh w16sdtfl w16du wp14">
   <w:p>
     <w:pPr>
-      <w:pStyle w:val="Pieddepage"/>
+      <w:pStyle w:val="Footer"/>
       <w:rPr>
         <w:rFonts w:ascii="Calibri" w:eastAsia="Calibri" w:hAnsi="Calibri" w:cs="Times New Roman"/>
         <w:sz w:val="26"/>
@@ -1573,8 +1707,9 @@
         <w:vertAlign w:val="superscript"/>
         <w:lang w:val="x-none" w:eastAsia="x-none"/>
       </w:rPr>
-      <w:t>Art 91 – II – 1° du Code Général des Impôts.</w:t>
+      <w:t xml:space="preserve">Art 91 – II – 1° du Code </w:t>
     </w:r>
+    <w:proofErr w:type="spellStart"/>
     <w:r>
       <w:rPr>
         <w:rFonts w:ascii="Calibri" w:eastAsia="Calibri" w:hAnsi="Calibri" w:cs="Times New Roman"/>
@@ -1583,6 +1718,49 @@
         <w:vertAlign w:val="superscript"/>
         <w:lang w:val="x-none" w:eastAsia="x-none"/>
       </w:rPr>
+      <w:t>Général</w:t>
+    </w:r>
+    <w:proofErr w:type="spellEnd"/>
+    <w:r>
+      <w:rPr>
+        <w:rFonts w:ascii="Calibri" w:eastAsia="Calibri" w:hAnsi="Calibri" w:cs="Times New Roman"/>
+        <w:sz w:val="26"/>
+        <w:szCs w:val="26"/>
+        <w:vertAlign w:val="superscript"/>
+        <w:lang w:val="x-none" w:eastAsia="x-none"/>
+      </w:rPr>
+      <w:t xml:space="preserve"> des </w:t>
+    </w:r>
+    <w:proofErr w:type="spellStart"/>
+    <w:r>
+      <w:rPr>
+        <w:rFonts w:ascii="Calibri" w:eastAsia="Calibri" w:hAnsi="Calibri" w:cs="Times New Roman"/>
+        <w:sz w:val="26"/>
+        <w:szCs w:val="26"/>
+        <w:vertAlign w:val="superscript"/>
+        <w:lang w:val="x-none" w:eastAsia="x-none"/>
+      </w:rPr>
+      <w:t>Impôts</w:t>
+    </w:r>
+    <w:proofErr w:type="spellEnd"/>
+    <w:r>
+      <w:rPr>
+        <w:rFonts w:ascii="Calibri" w:eastAsia="Calibri" w:hAnsi="Calibri" w:cs="Times New Roman"/>
+        <w:sz w:val="26"/>
+        <w:szCs w:val="26"/>
+        <w:vertAlign w:val="superscript"/>
+        <w:lang w:val="x-none" w:eastAsia="x-none"/>
+      </w:rPr>
+      <w:t>.</w:t>
+    </w:r>
+    <w:r>
+      <w:rPr>
+        <w:rFonts w:ascii="Calibri" w:eastAsia="Calibri" w:hAnsi="Calibri" w:cs="Times New Roman"/>
+        <w:sz w:val="26"/>
+        <w:szCs w:val="26"/>
+        <w:vertAlign w:val="superscript"/>
+        <w:lang w:val="x-none" w:eastAsia="x-none"/>
+      </w:rPr>
       <w:t xml:space="preserve">                                          </w:t>
     </w:r>
   </w:p>
@@ -1602,7 +1780,7 @@
   </w:p>
   <w:tbl>
     <w:tblPr>
-      <w:tblStyle w:val="Grilledutableau"/>
+      <w:tblStyle w:val="TableGrid"/>
       <w:tblW w:w="0" w:type="auto"/>
       <w:tblInd w:w="-5" w:type="dxa"/>
       <w:tblBorders>
@@ -1627,7 +1805,7 @@
         </w:tcPr>
         <w:p>
           <w:pPr>
-            <w:pStyle w:val="Pieddepage"/>
+            <w:pStyle w:val="Footer"/>
             <w:jc w:val="both"/>
             <w:rPr>
               <w:rFonts w:ascii="Calibri" w:eastAsia="Calibri" w:hAnsi="Calibri" w:cs="Times New Roman"/>
@@ -1692,7 +1870,7 @@
         </w:tcPr>
         <w:p>
           <w:pPr>
-            <w:pStyle w:val="Pieddepage"/>
+            <w:pStyle w:val="Footer"/>
             <w:jc w:val="both"/>
             <w:rPr>
               <w:rFonts w:ascii="Calibri" w:eastAsia="Calibri" w:hAnsi="Calibri" w:cs="Times New Roman"/>
@@ -1735,7 +1913,7 @@
         </w:tcPr>
         <w:p>
           <w:pPr>
-            <w:pStyle w:val="Pieddepage"/>
+            <w:pStyle w:val="Footer"/>
             <w:jc w:val="both"/>
             <w:rPr>
               <w:rFonts w:ascii="Calibri" w:eastAsia="Calibri" w:hAnsi="Calibri" w:cs="Times New Roman"/>
@@ -1776,7 +1954,7 @@
         </w:tcPr>
         <w:p>
           <w:pPr>
-            <w:pStyle w:val="Pieddepage"/>
+            <w:pStyle w:val="Footer"/>
             <w:jc w:val="both"/>
             <w:rPr>
               <w:rFonts w:ascii="Calibri" w:eastAsia="Calibri" w:hAnsi="Calibri" w:cs="Times New Roman"/>
@@ -1821,7 +1999,7 @@
         </w:tcPr>
         <w:p>
           <w:pPr>
-            <w:pStyle w:val="Pieddepage"/>
+            <w:pStyle w:val="Footer"/>
             <w:jc w:val="both"/>
             <w:rPr>
               <w:rFonts w:ascii="Calibri" w:eastAsia="Calibri" w:hAnsi="Calibri" w:cs="Times New Roman"/>
@@ -1890,7 +2068,7 @@
         </w:tcPr>
         <w:p>
           <w:pPr>
-            <w:pStyle w:val="Pieddepage"/>
+            <w:pStyle w:val="Footer"/>
             <w:jc w:val="both"/>
             <w:rPr>
               <w:rFonts w:ascii="Calibri" w:eastAsia="Calibri" w:hAnsi="Calibri" w:cs="Times New Roman"/>
@@ -1943,7 +2121,7 @@
         </w:tcPr>
         <w:p>
           <w:pPr>
-            <w:pStyle w:val="Pieddepage"/>
+            <w:pStyle w:val="Footer"/>
             <w:jc w:val="both"/>
             <w:rPr>
               <w:rFonts w:ascii="Calibri" w:eastAsia="Calibri" w:hAnsi="Calibri" w:cs="Times New Roman"/>
@@ -2012,7 +2190,7 @@
         </w:tcPr>
         <w:p>
           <w:pPr>
-            <w:pStyle w:val="Pieddepage"/>
+            <w:pStyle w:val="Footer"/>
             <w:jc w:val="both"/>
             <w:rPr>
               <w:rFonts w:ascii="Calibri" w:eastAsia="Calibri" w:hAnsi="Calibri" w:cs="Times New Roman"/>
@@ -2076,7 +2254,7 @@
   </w:tbl>
   <w:p>
     <w:pPr>
-      <w:pStyle w:val="Pieddepage"/>
+      <w:pStyle w:val="Footer"/>
       <w:jc w:val="both"/>
       <w:rPr>
         <w:sz w:val="26"/>
@@ -2091,7 +2269,7 @@
 <w:ftr xmlns:wpc="http://schemas.microsoft.com/office/word/2010/wordprocessingCanvas" xmlns:cx="http://schemas.microsoft.com/office/drawing/2014/chartex" xmlns:cx1="http://schemas.microsoft.com/office/drawing/2015/9/8/chartex" xmlns:cx2="http://schemas.microsoft.com/office/drawing/2015/10/21/chartex" xmlns:cx3="http://schemas.microsoft.com/office/drawing/2016/5/9/chartex" xmlns:cx4="http://schemas.microsoft.com/office/drawing/2016/5/10/chartex" xmlns:cx5="http://schemas.microsoft.com/office/drawing/2016/5/11/chartex" xmlns:cx6="http://schemas.microsoft.com/office/drawing/2016/5/12/chartex" xmlns:cx7="http://schemas.microsoft.com/office/drawing/2016/5/13/chartex" xmlns:cx8="http://schemas.microsoft.com/office/drawing/2016/5/14/chartex" xmlns:mc="http://schemas.openxmlformats.org/markup-compatibility/2006" xmlns:aink="http://schemas.microsoft.com/office/drawing/2016/ink" xmlns:am3d="http://schemas.microsoft.com/office/drawing/2017/model3d" xmlns:o="urn:schemas-microsoft-com:office:office" xmlns:oel="http://schemas.microsoft.com/office/2019/extlst" xmlns:r="http://schemas.openxmlformats.org/officeDocument/2006/relationships" xmlns:m="http://schemas.openxmlformats.org/officeDocument/2006/math" xmlns:v="urn:schemas-microsoft-com:vml" xmlns:wp14="http://schemas.microsoft.com/office/word/2010/wordprocessingDrawing" xmlns:wp="http://schemas.openxmlformats.org/drawingml/2006/wordprocessingDrawing" xmlns:w10="urn:schemas-microsoft-com:office:word" xmlns:w="http://schemas.openxmlformats.org/wordprocessingml/2006/main" xmlns:w14="http://schemas.microsoft.com/office/word/2010/wordml" xmlns:w15="http://schemas.microsoft.com/office/word/2012/wordml" xmlns:w16cex="http://schemas.microsoft.com/office/word/2018/wordml/cex" xmlns:w16cid="http://schemas.microsoft.com/office/word/2016/wordml/cid" xmlns:w16="http://schemas.microsoft.com/office/word/2018/wordml" xmlns:w16du="http://schemas.microsoft.com/office/word/2023/wordml/word16du" xmlns:w16sdtdh="http://schemas.microsoft.com/office/word/2020/wordml/sdtdatahash" xmlns:w16sdtfl="http://schemas.microsoft.com/office/word/2024/wordml/sdtformatlock" xmlns:w16se="http://schemas.microsoft.com/office/word/2015/wordml/symex" xmlns:wpg="http://schemas.microsoft.com/office/word/2010/wordprocessingGroup" xmlns:wpi="http://schemas.microsoft.com/office/word/2010/wordprocessingInk" xmlns:wne="http://schemas.microsoft.com/office/word/2006/wordml" xmlns:wps="http://schemas.microsoft.com/office/word/2010/wordprocessingShape" mc:Ignorable="w14 w15 w16se w16cid w16 w16cex w16sdtdh w16sdtfl w16du wp14">
   <w:p>
     <w:pPr>
-      <w:pStyle w:val="Pieddepage"/>
+      <w:pStyle w:val="Footer"/>
     </w:pPr>
   </w:p>
 </w:ftr>
@@ -2126,7 +2304,7 @@
 <w:hdr xmlns:wpc="http://schemas.microsoft.com/office/word/2010/wordprocessingCanvas" xmlns:cx="http://schemas.microsoft.com/office/drawing/2014/chartex" xmlns:cx1="http://schemas.microsoft.com/office/drawing/2015/9/8/chartex" xmlns:cx2="http://schemas.microsoft.com/office/drawing/2015/10/21/chartex" xmlns:cx3="http://schemas.microsoft.com/office/drawing/2016/5/9/chartex" xmlns:cx4="http://schemas.microsoft.com/office/drawing/2016/5/10/chartex" xmlns:cx5="http://schemas.microsoft.com/office/drawing/2016/5/11/chartex" xmlns:cx6="http://schemas.microsoft.com/office/drawing/2016/5/12/chartex" xmlns:cx7="http://schemas.microsoft.com/office/drawing/2016/5/13/chartex" xmlns:cx8="http://schemas.microsoft.com/office/drawing/2016/5/14/chartex" xmlns:mc="http://schemas.openxmlformats.org/markup-compatibility/2006" xmlns:aink="http://schemas.microsoft.com/office/drawing/2016/ink" xmlns:am3d="http://schemas.microsoft.com/office/drawing/2017/model3d" xmlns:o="urn:schemas-microsoft-com:office:office" xmlns:oel="http://schemas.microsoft.com/office/2019/extlst" xmlns:r="http://schemas.openxmlformats.org/officeDocument/2006/relationships" xmlns:m="http://schemas.openxmlformats.org/officeDocument/2006/math" xmlns:v="urn:schemas-microsoft-com:vml" xmlns:wp14="http://schemas.microsoft.com/office/word/2010/wordprocessingDrawing" xmlns:wp="http://schemas.openxmlformats.org/drawingml/2006/wordprocessingDrawing" xmlns:w10="urn:schemas-microsoft-com:office:word" xmlns:w="http://schemas.openxmlformats.org/wordprocessingml/2006/main" xmlns:w14="http://schemas.microsoft.com/office/word/2010/wordml" xmlns:w15="http://schemas.microsoft.com/office/word/2012/wordml" xmlns:w16cex="http://schemas.microsoft.com/office/word/2018/wordml/cex" xmlns:w16cid="http://schemas.microsoft.com/office/word/2016/wordml/cid" xmlns:w16="http://schemas.microsoft.com/office/word/2018/wordml" xmlns:w16du="http://schemas.microsoft.com/office/word/2023/wordml/word16du" xmlns:w16sdtdh="http://schemas.microsoft.com/office/word/2020/wordml/sdtdatahash" xmlns:w16sdtfl="http://schemas.microsoft.com/office/word/2024/wordml/sdtformatlock" xmlns:w16se="http://schemas.microsoft.com/office/word/2015/wordml/symex" xmlns:wpg="http://schemas.microsoft.com/office/word/2010/wordprocessingGroup" xmlns:wpi="http://schemas.microsoft.com/office/word/2010/wordprocessingInk" xmlns:wne="http://schemas.microsoft.com/office/word/2006/wordml" xmlns:wps="http://schemas.microsoft.com/office/word/2010/wordprocessingShape" mc:Ignorable="w14 w15 w16se w16cid w16 w16cex w16sdtdh w16sdtfl w16du wp14">
   <w:p>
     <w:pPr>
-      <w:pStyle w:val="En-tte"/>
+      <w:pStyle w:val="Header"/>
     </w:pPr>
   </w:p>
 </w:hdr>
@@ -2136,7 +2314,7 @@
 <w:hdr xmlns:wpc="http://schemas.microsoft.com/office/word/2010/wordprocessingCanvas" xmlns:cx="http://schemas.microsoft.com/office/drawing/2014/chartex" xmlns:cx1="http://schemas.microsoft.com/office/drawing/2015/9/8/chartex" xmlns:cx2="http://schemas.microsoft.com/office/drawing/2015/10/21/chartex" xmlns:cx3="http://schemas.microsoft.com/office/drawing/2016/5/9/chartex" xmlns:cx4="http://schemas.microsoft.com/office/drawing/2016/5/10/chartex" xmlns:cx5="http://schemas.microsoft.com/office/drawing/2016/5/11/chartex" xmlns:cx6="http://schemas.microsoft.com/office/drawing/2016/5/12/chartex" xmlns:cx7="http://schemas.microsoft.com/office/drawing/2016/5/13/chartex" xmlns:cx8="http://schemas.microsoft.com/office/drawing/2016/5/14/chartex" xmlns:mc="http://schemas.openxmlformats.org/markup-compatibility/2006" xmlns:aink="http://schemas.microsoft.com/office/drawing/2016/ink" xmlns:am3d="http://schemas.microsoft.com/office/drawing/2017/model3d" xmlns:o="urn:schemas-microsoft-com:office:office" xmlns:oel="http://schemas.microsoft.com/office/2019/extlst" xmlns:r="http://schemas.openxmlformats.org/officeDocument/2006/relationships" xmlns:m="http://schemas.openxmlformats.org/officeDocument/2006/math" xmlns:v="urn:schemas-microsoft-com:vml" xmlns:wp14="http://schemas.microsoft.com/office/word/2010/wordprocessingDrawing" xmlns:wp="http://schemas.openxmlformats.org/drawingml/2006/wordprocessingDrawing" xmlns:w10="urn:schemas-microsoft-com:office:word" xmlns:w="http://schemas.openxmlformats.org/wordprocessingml/2006/main" xmlns:w14="http://schemas.microsoft.com/office/word/2010/wordml" xmlns:w15="http://schemas.microsoft.com/office/word/2012/wordml" xmlns:w16cex="http://schemas.microsoft.com/office/word/2018/wordml/cex" xmlns:w16cid="http://schemas.microsoft.com/office/word/2016/wordml/cid" xmlns:w16="http://schemas.microsoft.com/office/word/2018/wordml" xmlns:w16du="http://schemas.microsoft.com/office/word/2023/wordml/word16du" xmlns:w16sdtdh="http://schemas.microsoft.com/office/word/2020/wordml/sdtdatahash" xmlns:w16sdtfl="http://schemas.microsoft.com/office/word/2024/wordml/sdtformatlock" xmlns:w16se="http://schemas.microsoft.com/office/word/2015/wordml/symex" xmlns:wpg="http://schemas.microsoft.com/office/word/2010/wordprocessingGroup" xmlns:wpi="http://schemas.microsoft.com/office/word/2010/wordprocessingInk" xmlns:wne="http://schemas.microsoft.com/office/word/2006/wordml" xmlns:wps="http://schemas.microsoft.com/office/word/2010/wordprocessingShape" mc:Ignorable="w14 w15 w16se w16cid w16 w16cex w16sdtdh w16sdtfl w16du wp14">
   <w:p>
     <w:pPr>
-      <w:pStyle w:val="En-tte"/>
+      <w:pStyle w:val="Header"/>
     </w:pPr>
   </w:p>
 </w:hdr>
@@ -2146,7 +2324,7 @@
 <w:hdr xmlns:wpc="http://schemas.microsoft.com/office/word/2010/wordprocessingCanvas" xmlns:cx="http://schemas.microsoft.com/office/drawing/2014/chartex" xmlns:cx1="http://schemas.microsoft.com/office/drawing/2015/9/8/chartex" xmlns:cx2="http://schemas.microsoft.com/office/drawing/2015/10/21/chartex" xmlns:cx3="http://schemas.microsoft.com/office/drawing/2016/5/9/chartex" xmlns:cx4="http://schemas.microsoft.com/office/drawing/2016/5/10/chartex" xmlns:cx5="http://schemas.microsoft.com/office/drawing/2016/5/11/chartex" xmlns:cx6="http://schemas.microsoft.com/office/drawing/2016/5/12/chartex" xmlns:cx7="http://schemas.microsoft.com/office/drawing/2016/5/13/chartex" xmlns:cx8="http://schemas.microsoft.com/office/drawing/2016/5/14/chartex" xmlns:mc="http://schemas.openxmlformats.org/markup-compatibility/2006" xmlns:aink="http://schemas.microsoft.com/office/drawing/2016/ink" xmlns:am3d="http://schemas.microsoft.com/office/drawing/2017/model3d" xmlns:o="urn:schemas-microsoft-com:office:office" xmlns:oel="http://schemas.microsoft.com/office/2019/extlst" xmlns:r="http://schemas.openxmlformats.org/officeDocument/2006/relationships" xmlns:m="http://schemas.openxmlformats.org/officeDocument/2006/math" xmlns:v="urn:schemas-microsoft-com:vml" xmlns:wp14="http://schemas.microsoft.com/office/word/2010/wordprocessingDrawing" xmlns:wp="http://schemas.openxmlformats.org/drawingml/2006/wordprocessingDrawing" xmlns:w10="urn:schemas-microsoft-com:office:word" xmlns:w="http://schemas.openxmlformats.org/wordprocessingml/2006/main" xmlns:w14="http://schemas.microsoft.com/office/word/2010/wordml" xmlns:w15="http://schemas.microsoft.com/office/word/2012/wordml" xmlns:w16cex="http://schemas.microsoft.com/office/word/2018/wordml/cex" xmlns:w16cid="http://schemas.microsoft.com/office/word/2016/wordml/cid" xmlns:w16="http://schemas.microsoft.com/office/word/2018/wordml" xmlns:w16du="http://schemas.microsoft.com/office/word/2023/wordml/word16du" xmlns:w16sdtdh="http://schemas.microsoft.com/office/word/2020/wordml/sdtdatahash" xmlns:w16sdtfl="http://schemas.microsoft.com/office/word/2024/wordml/sdtformatlock" xmlns:w16se="http://schemas.microsoft.com/office/word/2015/wordml/symex" xmlns:wpg="http://schemas.microsoft.com/office/word/2010/wordprocessingGroup" xmlns:wpi="http://schemas.microsoft.com/office/word/2010/wordprocessingInk" xmlns:wne="http://schemas.microsoft.com/office/word/2006/wordml" xmlns:wps="http://schemas.microsoft.com/office/word/2010/wordprocessingShape" mc:Ignorable="w14 w15 w16se w16cid w16 w16cex w16sdtdh w16sdtfl w16du wp14">
   <w:p>
     <w:pPr>
-      <w:pStyle w:val="En-tte"/>
+      <w:pStyle w:val="Header"/>
     </w:pPr>
   </w:p>
 </w:hdr>
@@ -3191,11 +3369,11 @@
     <w:qFormat/>
     <w:rsid w:val="00393904"/>
   </w:style>
-  <w:style w:type="paragraph" w:styleId="Titre1">
+  <w:style w:type="paragraph" w:styleId="Heading1">
     <w:name w:val="heading 1"/>
     <w:basedOn w:val="Normal"/>
     <w:next w:val="Normal"/>
-    <w:link w:val="Titre1Car"/>
+    <w:link w:val="Heading1Char"/>
     <w:uiPriority w:val="9"/>
     <w:qFormat/>
     <w:rsid w:val="00A179B6"/>
@@ -3212,11 +3390,11 @@
       <w:szCs w:val="40"/>
     </w:rPr>
   </w:style>
-  <w:style w:type="paragraph" w:styleId="Titre2">
+  <w:style w:type="paragraph" w:styleId="Heading2">
     <w:name w:val="heading 2"/>
     <w:basedOn w:val="Normal"/>
     <w:next w:val="Normal"/>
-    <w:link w:val="Titre2Car"/>
+    <w:link w:val="Heading2Char"/>
     <w:uiPriority w:val="9"/>
     <w:semiHidden/>
     <w:unhideWhenUsed/>
@@ -3235,11 +3413,11 @@
       <w:szCs w:val="32"/>
     </w:rPr>
   </w:style>
-  <w:style w:type="paragraph" w:styleId="Titre3">
+  <w:style w:type="paragraph" w:styleId="Heading3">
     <w:name w:val="heading 3"/>
     <w:basedOn w:val="Normal"/>
     <w:next w:val="Normal"/>
-    <w:link w:val="Titre3Car"/>
+    <w:link w:val="Heading3Char"/>
     <w:uiPriority w:val="9"/>
     <w:semiHidden/>
     <w:unhideWhenUsed/>
@@ -3258,11 +3436,11 @@
       <w:szCs w:val="28"/>
     </w:rPr>
   </w:style>
-  <w:style w:type="paragraph" w:styleId="Titre4">
+  <w:style w:type="paragraph" w:styleId="Heading4">
     <w:name w:val="heading 4"/>
     <w:basedOn w:val="Normal"/>
     <w:next w:val="Normal"/>
-    <w:link w:val="Titre4Car"/>
+    <w:link w:val="Heading4Char"/>
     <w:uiPriority w:val="9"/>
     <w:semiHidden/>
     <w:unhideWhenUsed/>
@@ -3281,11 +3459,11 @@
       <w:color w:val="2F5496" w:themeColor="accent1" w:themeShade="BF"/>
     </w:rPr>
   </w:style>
-  <w:style w:type="paragraph" w:styleId="Titre5">
+  <w:style w:type="paragraph" w:styleId="Heading5">
     <w:name w:val="heading 5"/>
     <w:basedOn w:val="Normal"/>
     <w:next w:val="Normal"/>
-    <w:link w:val="Titre5Car"/>
+    <w:link w:val="Heading5Char"/>
     <w:uiPriority w:val="9"/>
     <w:semiHidden/>
     <w:unhideWhenUsed/>
@@ -3302,11 +3480,11 @@
       <w:color w:val="2F5496" w:themeColor="accent1" w:themeShade="BF"/>
     </w:rPr>
   </w:style>
-  <w:style w:type="paragraph" w:styleId="Titre6">
+  <w:style w:type="paragraph" w:styleId="Heading6">
     <w:name w:val="heading 6"/>
     <w:basedOn w:val="Normal"/>
     <w:next w:val="Normal"/>
-    <w:link w:val="Titre6Car"/>
+    <w:link w:val="Heading6Char"/>
     <w:uiPriority w:val="9"/>
     <w:semiHidden/>
     <w:unhideWhenUsed/>
@@ -3325,11 +3503,11 @@
       <w:color w:val="595959" w:themeColor="text1" w:themeTint="A6"/>
     </w:rPr>
   </w:style>
-  <w:style w:type="paragraph" w:styleId="Titre7">
+  <w:style w:type="paragraph" w:styleId="Heading7">
     <w:name w:val="heading 7"/>
     <w:basedOn w:val="Normal"/>
     <w:next w:val="Normal"/>
-    <w:link w:val="Titre7Car"/>
+    <w:link w:val="Heading7Char"/>
     <w:uiPriority w:val="9"/>
     <w:semiHidden/>
     <w:unhideWhenUsed/>
@@ -3346,11 +3524,11 @@
       <w:color w:val="595959" w:themeColor="text1" w:themeTint="A6"/>
     </w:rPr>
   </w:style>
-  <w:style w:type="paragraph" w:styleId="Titre8">
+  <w:style w:type="paragraph" w:styleId="Heading8">
     <w:name w:val="heading 8"/>
     <w:basedOn w:val="Normal"/>
     <w:next w:val="Normal"/>
-    <w:link w:val="Titre8Car"/>
+    <w:link w:val="Heading8Char"/>
     <w:uiPriority w:val="9"/>
     <w:semiHidden/>
     <w:unhideWhenUsed/>
@@ -3369,11 +3547,11 @@
       <w:color w:val="272727" w:themeColor="text1" w:themeTint="D8"/>
     </w:rPr>
   </w:style>
-  <w:style w:type="paragraph" w:styleId="Titre9">
+  <w:style w:type="paragraph" w:styleId="Heading9">
     <w:name w:val="heading 9"/>
     <w:basedOn w:val="Normal"/>
     <w:next w:val="Normal"/>
-    <w:link w:val="Titre9Car"/>
+    <w:link w:val="Heading9Char"/>
     <w:uiPriority w:val="9"/>
     <w:semiHidden/>
     <w:unhideWhenUsed/>
@@ -3390,13 +3568,13 @@
       <w:color w:val="272727" w:themeColor="text1" w:themeTint="D8"/>
     </w:rPr>
   </w:style>
-  <w:style w:type="character" w:default="1" w:styleId="Policepardfaut">
+  <w:style w:type="character" w:default="1" w:styleId="DefaultParagraphFont">
     <w:name w:val="Default Paragraph Font"/>
     <w:uiPriority w:val="1"/>
     <w:semiHidden/>
     <w:unhideWhenUsed/>
   </w:style>
-  <w:style w:type="table" w:default="1" w:styleId="TableauNormal">
+  <w:style w:type="table" w:default="1" w:styleId="TableNormal">
     <w:name w:val="Normal Table"/>
     <w:uiPriority w:val="99"/>
     <w:semiHidden/>
@@ -3411,16 +3589,16 @@
       </w:tblCellMar>
     </w:tblPr>
   </w:style>
-  <w:style w:type="numbering" w:default="1" w:styleId="Aucuneliste">
+  <w:style w:type="numbering" w:default="1" w:styleId="NoList">
     <w:name w:val="No List"/>
     <w:uiPriority w:val="99"/>
     <w:semiHidden/>
     <w:unhideWhenUsed/>
   </w:style>
-  <w:style w:type="character" w:customStyle="1" w:styleId="Titre1Car">
-    <w:name w:val="Titre 1 Car"/>
-    <w:basedOn w:val="Policepardfaut"/>
-    <w:link w:val="Titre1"/>
+  <w:style w:type="character" w:customStyle="1" w:styleId="Heading1Char">
+    <w:name w:val="Heading 1 Char"/>
+    <w:basedOn w:val="DefaultParagraphFont"/>
+    <w:link w:val="Heading1"/>
     <w:uiPriority w:val="9"/>
     <w:rsid w:val="00A179B6"/>
     <w:rPr>
@@ -3430,10 +3608,10 @@
       <w:szCs w:val="40"/>
     </w:rPr>
   </w:style>
-  <w:style w:type="character" w:customStyle="1" w:styleId="Titre2Car">
-    <w:name w:val="Titre 2 Car"/>
-    <w:basedOn w:val="Policepardfaut"/>
-    <w:link w:val="Titre2"/>
+  <w:style w:type="character" w:customStyle="1" w:styleId="Heading2Char">
+    <w:name w:val="Heading 2 Char"/>
+    <w:basedOn w:val="DefaultParagraphFont"/>
+    <w:link w:val="Heading2"/>
     <w:uiPriority w:val="9"/>
     <w:semiHidden/>
     <w:rsid w:val="00A179B6"/>
@@ -3444,10 +3622,10 @@
       <w:szCs w:val="32"/>
     </w:rPr>
   </w:style>
-  <w:style w:type="character" w:customStyle="1" w:styleId="Titre3Car">
-    <w:name w:val="Titre 3 Car"/>
-    <w:basedOn w:val="Policepardfaut"/>
-    <w:link w:val="Titre3"/>
+  <w:style w:type="character" w:customStyle="1" w:styleId="Heading3Char">
+    <w:name w:val="Heading 3 Char"/>
+    <w:basedOn w:val="DefaultParagraphFont"/>
+    <w:link w:val="Heading3"/>
     <w:uiPriority w:val="9"/>
     <w:semiHidden/>
     <w:rsid w:val="00A179B6"/>
@@ -3458,10 +3636,10 @@
       <w:szCs w:val="28"/>
     </w:rPr>
   </w:style>
-  <w:style w:type="character" w:customStyle="1" w:styleId="Titre4Car">
-    <w:name w:val="Titre 4 Car"/>
-    <w:basedOn w:val="Policepardfaut"/>
-    <w:link w:val="Titre4"/>
+  <w:style w:type="character" w:customStyle="1" w:styleId="Heading4Char">
+    <w:name w:val="Heading 4 Char"/>
+    <w:basedOn w:val="DefaultParagraphFont"/>
+    <w:link w:val="Heading4"/>
     <w:uiPriority w:val="9"/>
     <w:semiHidden/>
     <w:rsid w:val="00A179B6"/>
@@ -3472,10 +3650,10 @@
       <w:color w:val="2F5496" w:themeColor="accent1" w:themeShade="BF"/>
     </w:rPr>
   </w:style>
-  <w:style w:type="character" w:customStyle="1" w:styleId="Titre5Car">
-    <w:name w:val="Titre 5 Car"/>
-    <w:basedOn w:val="Policepardfaut"/>
-    <w:link w:val="Titre5"/>
+  <w:style w:type="character" w:customStyle="1" w:styleId="Heading5Char">
+    <w:name w:val="Heading 5 Char"/>
+    <w:basedOn w:val="DefaultParagraphFont"/>
+    <w:link w:val="Heading5"/>
     <w:uiPriority w:val="9"/>
     <w:semiHidden/>
     <w:rsid w:val="00A179B6"/>
@@ -3484,10 +3662,10 @@
       <w:color w:val="2F5496" w:themeColor="accent1" w:themeShade="BF"/>
     </w:rPr>
   </w:style>
-  <w:style w:type="character" w:customStyle="1" w:styleId="Titre6Car">
-    <w:name w:val="Titre 6 Car"/>
-    <w:basedOn w:val="Policepardfaut"/>
-    <w:link w:val="Titre6"/>
+  <w:style w:type="character" w:customStyle="1" w:styleId="Heading6Char">
+    <w:name w:val="Heading 6 Char"/>
+    <w:basedOn w:val="DefaultParagraphFont"/>
+    <w:link w:val="Heading6"/>
     <w:uiPriority w:val="9"/>
     <w:semiHidden/>
     <w:rsid w:val="00A179B6"/>
@@ -3498,10 +3676,10 @@
       <w:color w:val="595959" w:themeColor="text1" w:themeTint="A6"/>
     </w:rPr>
   </w:style>
-  <w:style w:type="character" w:customStyle="1" w:styleId="Titre7Car">
-    <w:name w:val="Titre 7 Car"/>
-    <w:basedOn w:val="Policepardfaut"/>
-    <w:link w:val="Titre7"/>
+  <w:style w:type="character" w:customStyle="1" w:styleId="Heading7Char">
+    <w:name w:val="Heading 7 Char"/>
+    <w:basedOn w:val="DefaultParagraphFont"/>
+    <w:link w:val="Heading7"/>
     <w:uiPriority w:val="9"/>
     <w:semiHidden/>
     <w:rsid w:val="00A179B6"/>
@@ -3510,10 +3688,10 @@
       <w:color w:val="595959" w:themeColor="text1" w:themeTint="A6"/>
     </w:rPr>
   </w:style>
-  <w:style w:type="character" w:customStyle="1" w:styleId="Titre8Car">
-    <w:name w:val="Titre 8 Car"/>
-    <w:basedOn w:val="Policepardfaut"/>
-    <w:link w:val="Titre8"/>
+  <w:style w:type="character" w:customStyle="1" w:styleId="Heading8Char">
+    <w:name w:val="Heading 8 Char"/>
+    <w:basedOn w:val="DefaultParagraphFont"/>
+    <w:link w:val="Heading8"/>
     <w:uiPriority w:val="9"/>
     <w:semiHidden/>
     <w:rsid w:val="00A179B6"/>
@@ -3524,10 +3702,10 @@
       <w:color w:val="272727" w:themeColor="text1" w:themeTint="D8"/>
     </w:rPr>
   </w:style>
-  <w:style w:type="character" w:customStyle="1" w:styleId="Titre9Car">
-    <w:name w:val="Titre 9 Car"/>
-    <w:basedOn w:val="Policepardfaut"/>
-    <w:link w:val="Titre9"/>
+  <w:style w:type="character" w:customStyle="1" w:styleId="Heading9Char">
+    <w:name w:val="Heading 9 Char"/>
+    <w:basedOn w:val="DefaultParagraphFont"/>
+    <w:link w:val="Heading9"/>
     <w:uiPriority w:val="9"/>
     <w:semiHidden/>
     <w:rsid w:val="00A179B6"/>
@@ -3536,11 +3714,11 @@
       <w:color w:val="272727" w:themeColor="text1" w:themeTint="D8"/>
     </w:rPr>
   </w:style>
-  <w:style w:type="paragraph" w:styleId="Titre">
+  <w:style w:type="paragraph" w:styleId="Title">
     <w:name w:val="Title"/>
     <w:basedOn w:val="Normal"/>
     <w:next w:val="Normal"/>
-    <w:link w:val="TitreCar"/>
+    <w:link w:val="TitleChar"/>
     <w:uiPriority w:val="10"/>
     <w:qFormat/>
     <w:rsid w:val="00A179B6"/>
@@ -3556,10 +3734,10 @@
       <w:szCs w:val="56"/>
     </w:rPr>
   </w:style>
-  <w:style w:type="character" w:customStyle="1" w:styleId="TitreCar">
-    <w:name w:val="Titre Car"/>
-    <w:basedOn w:val="Policepardfaut"/>
-    <w:link w:val="Titre"/>
+  <w:style w:type="character" w:customStyle="1" w:styleId="TitleChar">
+    <w:name w:val="Title Char"/>
+    <w:basedOn w:val="DefaultParagraphFont"/>
+    <w:link w:val="Title"/>
     <w:uiPriority w:val="10"/>
     <w:rsid w:val="00A179B6"/>
     <w:rPr>
@@ -3570,11 +3748,11 @@
       <w:szCs w:val="56"/>
     </w:rPr>
   </w:style>
-  <w:style w:type="paragraph" w:styleId="Sous-titre">
+  <w:style w:type="paragraph" w:styleId="Subtitle">
     <w:name w:val="Subtitle"/>
     <w:basedOn w:val="Normal"/>
     <w:next w:val="Normal"/>
-    <w:link w:val="Sous-titreCar"/>
+    <w:link w:val="SubtitleChar"/>
     <w:uiPriority w:val="11"/>
     <w:qFormat/>
     <w:rsid w:val="00A179B6"/>
@@ -3591,10 +3769,10 @@
       <w:szCs w:val="28"/>
     </w:rPr>
   </w:style>
-  <w:style w:type="character" w:customStyle="1" w:styleId="Sous-titreCar">
-    <w:name w:val="Sous-titre Car"/>
-    <w:basedOn w:val="Policepardfaut"/>
-    <w:link w:val="Sous-titre"/>
+  <w:style w:type="character" w:customStyle="1" w:styleId="SubtitleChar">
+    <w:name w:val="Subtitle Char"/>
+    <w:basedOn w:val="DefaultParagraphFont"/>
+    <w:link w:val="Subtitle"/>
     <w:uiPriority w:val="11"/>
     <w:rsid w:val="00A179B6"/>
     <w:rPr>
@@ -3605,11 +3783,11 @@
       <w:szCs w:val="28"/>
     </w:rPr>
   </w:style>
-  <w:style w:type="paragraph" w:styleId="Citation">
+  <w:style w:type="paragraph" w:styleId="Quote">
     <w:name w:val="Quote"/>
     <w:basedOn w:val="Normal"/>
     <w:next w:val="Normal"/>
-    <w:link w:val="CitationCar"/>
+    <w:link w:val="QuoteChar"/>
     <w:uiPriority w:val="29"/>
     <w:qFormat/>
     <w:rsid w:val="00A179B6"/>
@@ -3623,10 +3801,10 @@
       <w:color w:val="404040" w:themeColor="text1" w:themeTint="BF"/>
     </w:rPr>
   </w:style>
-  <w:style w:type="character" w:customStyle="1" w:styleId="CitationCar">
-    <w:name w:val="Citation Car"/>
-    <w:basedOn w:val="Policepardfaut"/>
-    <w:link w:val="Citation"/>
+  <w:style w:type="character" w:customStyle="1" w:styleId="QuoteChar">
+    <w:name w:val="Quote Char"/>
+    <w:basedOn w:val="DefaultParagraphFont"/>
+    <w:link w:val="Quote"/>
     <w:uiPriority w:val="29"/>
     <w:rsid w:val="00A179B6"/>
     <w:rPr>
@@ -3635,7 +3813,7 @@
       <w:color w:val="404040" w:themeColor="text1" w:themeTint="BF"/>
     </w:rPr>
   </w:style>
-  <w:style w:type="paragraph" w:styleId="Paragraphedeliste">
+  <w:style w:type="paragraph" w:styleId="ListParagraph">
     <w:name w:val="List Paragraph"/>
     <w:basedOn w:val="Normal"/>
     <w:uiPriority w:val="34"/>
@@ -3646,9 +3824,9 @@
       <w:contextualSpacing/>
     </w:pPr>
   </w:style>
-  <w:style w:type="character" w:styleId="Accentuationintense">
+  <w:style w:type="character" w:styleId="IntenseEmphasis">
     <w:name w:val="Intense Emphasis"/>
-    <w:basedOn w:val="Policepardfaut"/>
+    <w:basedOn w:val="DefaultParagraphFont"/>
     <w:uiPriority w:val="21"/>
     <w:qFormat/>
     <w:rsid w:val="00A179B6"/>
@@ -3658,11 +3836,11 @@
       <w:color w:val="2F5496" w:themeColor="accent1" w:themeShade="BF"/>
     </w:rPr>
   </w:style>
-  <w:style w:type="paragraph" w:styleId="Citationintense">
+  <w:style w:type="paragraph" w:styleId="IntenseQuote">
     <w:name w:val="Intense Quote"/>
     <w:basedOn w:val="Normal"/>
     <w:next w:val="Normal"/>
-    <w:link w:val="CitationintenseCar"/>
+    <w:link w:val="IntenseQuoteChar"/>
     <w:uiPriority w:val="30"/>
     <w:qFormat/>
     <w:rsid w:val="00A179B6"/>
@@ -3681,10 +3859,10 @@
       <w:color w:val="2F5496" w:themeColor="accent1" w:themeShade="BF"/>
     </w:rPr>
   </w:style>
-  <w:style w:type="character" w:customStyle="1" w:styleId="CitationintenseCar">
-    <w:name w:val="Citation intense Car"/>
-    <w:basedOn w:val="Policepardfaut"/>
-    <w:link w:val="Citationintense"/>
+  <w:style w:type="character" w:customStyle="1" w:styleId="IntenseQuoteChar">
+    <w:name w:val="Intense Quote Char"/>
+    <w:basedOn w:val="DefaultParagraphFont"/>
+    <w:link w:val="IntenseQuote"/>
     <w:uiPriority w:val="30"/>
     <w:rsid w:val="00A179B6"/>
     <w:rPr>
@@ -3693,9 +3871,9 @@
       <w:color w:val="2F5496" w:themeColor="accent1" w:themeShade="BF"/>
     </w:rPr>
   </w:style>
-  <w:style w:type="character" w:styleId="Rfrenceintense">
+  <w:style w:type="character" w:styleId="IntenseReference">
     <w:name w:val="Intense Reference"/>
-    <w:basedOn w:val="Policepardfaut"/>
+    <w:basedOn w:val="DefaultParagraphFont"/>
     <w:uiPriority w:val="32"/>
     <w:qFormat/>
     <w:rsid w:val="00A179B6"/>
@@ -3707,10 +3885,10 @@
       <w:spacing w:val="5"/>
     </w:rPr>
   </w:style>
-  <w:style w:type="paragraph" w:styleId="Notedebasdepage">
+  <w:style w:type="paragraph" w:styleId="FootnoteText">
     <w:name w:val="footnote text"/>
     <w:basedOn w:val="Normal"/>
-    <w:link w:val="NotedebasdepageCar"/>
+    <w:link w:val="FootnoteTextChar"/>
     <w:uiPriority w:val="99"/>
     <w:unhideWhenUsed/>
     <w:rsid w:val="00EF4D84"/>
@@ -3724,10 +3902,10 @@
       <w:lang w:val="x-none" w:eastAsia="x-none"/>
     </w:rPr>
   </w:style>
-  <w:style w:type="character" w:customStyle="1" w:styleId="NotedebasdepageCar">
-    <w:name w:val="Note de bas de page Car"/>
-    <w:basedOn w:val="Policepardfaut"/>
-    <w:link w:val="Notedebasdepage"/>
+  <w:style w:type="character" w:customStyle="1" w:styleId="FootnoteTextChar">
+    <w:name w:val="Footnote Text Char"/>
+    <w:basedOn w:val="DefaultParagraphFont"/>
+    <w:link w:val="FootnoteText"/>
     <w:uiPriority w:val="99"/>
     <w:rsid w:val="00EF4D84"/>
     <w:rPr>
@@ -3737,7 +3915,7 @@
       <w:lang w:val="x-none" w:eastAsia="x-none"/>
     </w:rPr>
   </w:style>
-  <w:style w:type="character" w:styleId="Appelnotedebasdep">
+  <w:style w:type="character" w:styleId="FootnoteReference">
     <w:name w:val="footnote reference"/>
     <w:uiPriority w:val="99"/>
     <w:semiHidden/>
@@ -3747,10 +3925,10 @@
       <w:vertAlign w:val="superscript"/>
     </w:rPr>
   </w:style>
-  <w:style w:type="paragraph" w:styleId="En-tte">
+  <w:style w:type="paragraph" w:styleId="Header">
     <w:name w:val="header"/>
     <w:basedOn w:val="Normal"/>
-    <w:link w:val="En-tteCar"/>
+    <w:link w:val="HeaderChar"/>
     <w:uiPriority w:val="99"/>
     <w:unhideWhenUsed/>
     <w:rsid w:val="00EF4D84"/>
@@ -3762,17 +3940,17 @@
       <w:spacing w:after="0" w:line="240" w:lineRule="auto"/>
     </w:pPr>
   </w:style>
-  <w:style w:type="character" w:customStyle="1" w:styleId="En-tteCar">
-    <w:name w:val="En-tête Car"/>
-    <w:basedOn w:val="Policepardfaut"/>
-    <w:link w:val="En-tte"/>
+  <w:style w:type="character" w:customStyle="1" w:styleId="HeaderChar">
+    <w:name w:val="Header Char"/>
+    <w:basedOn w:val="DefaultParagraphFont"/>
+    <w:link w:val="Header"/>
     <w:uiPriority w:val="99"/>
     <w:rsid w:val="00EF4D84"/>
   </w:style>
-  <w:style w:type="paragraph" w:styleId="Pieddepage">
+  <w:style w:type="paragraph" w:styleId="Footer">
     <w:name w:val="footer"/>
     <w:basedOn w:val="Normal"/>
-    <w:link w:val="PieddepageCar"/>
+    <w:link w:val="FooterChar"/>
     <w:uiPriority w:val="99"/>
     <w:unhideWhenUsed/>
     <w:rsid w:val="00EF4D84"/>
@@ -3784,16 +3962,16 @@
       <w:spacing w:after="0" w:line="240" w:lineRule="auto"/>
     </w:pPr>
   </w:style>
-  <w:style w:type="character" w:customStyle="1" w:styleId="PieddepageCar">
-    <w:name w:val="Pied de page Car"/>
-    <w:basedOn w:val="Policepardfaut"/>
-    <w:link w:val="Pieddepage"/>
+  <w:style w:type="character" w:customStyle="1" w:styleId="FooterChar">
+    <w:name w:val="Footer Char"/>
+    <w:basedOn w:val="DefaultParagraphFont"/>
+    <w:link w:val="Footer"/>
     <w:uiPriority w:val="99"/>
     <w:rsid w:val="00EF4D84"/>
   </w:style>
-  <w:style w:type="table" w:styleId="Grilledutableau">
+  <w:style w:type="table" w:styleId="TableGrid">
     <w:name w:val="Table Grid"/>
-    <w:basedOn w:val="TableauNormal"/>
+    <w:basedOn w:val="TableNormal"/>
     <w:uiPriority w:val="39"/>
     <w:rsid w:val="003E66F8"/>
     <w:pPr>

</xml_diff>